<commit_message>
fix ondina brainstorm transcript final turn
</commit_message>
<xml_diff>
--- a/worlds/ondina-vasquell/submission/Ondina_Vasquell_Brainstorm_Claude_Transcript.docx
+++ b/worlds/ondina-vasquell/submission/Ondina_Vasquell_Brainstorm_Claude_Transcript.docx
@@ -5201,6 +5201,71 @@
         <w:rPr>
           <w:rFonts w:ascii="Arial" w:hAnsi="Arial"/>
           <w:b/>
+          <w:color w:val="1F4D78"/>
+          <w:sz w:val="22"/>
+        </w:rPr>
+        <w:t>Human</w:t>
+      </w:r>
+    </w:p>
+    <w:tbl>
+      <w:tblPr>
+        <w:tblW w:type="dxa" w:w="9360"/>
+        <w:jc w:val="center"/>
+        <w:tblLayout w:type="fixed"/>
+        <w:tblLook w:firstColumn="1" w:firstRow="1" w:lastColumn="0" w:lastRow="0" w:noHBand="0" w:noVBand="1" w:val="04A0"/>
+      </w:tblPr>
+      <w:tblGrid>
+        <w:gridCol w:w="9360"/>
+      </w:tblGrid>
+      <w:tr>
+        <w:tc>
+          <w:tcPr>
+            <w:tcW w:type="dxa" w:w="9360"/>
+            <w:tcMar>
+              <w:top w:w="130" w:type="dxa"/>
+              <w:start w:w="170" w:type="dxa"/>
+              <w:bottom w:w="130" w:type="dxa"/>
+              <w:end w:w="170" w:type="dxa"/>
+            </w:tcMar>
+            <w:vAlign w:val="top"/>
+            <w:shd w:fill="F6F8FA"/>
+            <w:tcBorders>
+              <w:top w:val="single" w:sz="6" w:space="0" w:color="D0D7DE"/>
+              <w:right w:val="single" w:sz="6" w:space="0" w:color="D0D7DE"/>
+              <w:bottom w:val="single" w:sz="6" w:space="0" w:color="D0D7DE"/>
+              <w:left w:val="single" w:sz="14" w:space="0" w:color="1F4D78"/>
+            </w:tcBorders>
+          </w:tcPr>
+          <w:p>
+            <w:pPr>
+              <w:spacing w:before="0" w:after="20" w:line="232" w:lineRule="auto"/>
+            </w:pPr>
+            <w:r>
+              <w:rPr>
+                <w:rFonts w:ascii="Courier New" w:hAnsi="Courier New"/>
+                <w:color w:val="111827"/>
+                <w:sz w:val="17"/>
+              </w:rPr>
+              <w:t>Final readiness check.</w:t>
+            </w:r>
+          </w:p>
+        </w:tc>
+      </w:tr>
+    </w:tbl>
+    <w:p>
+      <w:pPr>
+        <w:spacing w:before="0" w:after="60" w:line="200" w:lineRule="auto"/>
+      </w:pPr>
+    </w:p>
+    <w:p/>
+    <w:p>
+      <w:pPr>
+        <w:spacing w:before="60" w:after="60" w:line="250" w:lineRule="auto"/>
+      </w:pPr>
+      <w:r>
+        <w:rPr>
+          <w:rFonts w:ascii="Arial" w:hAnsi="Arial"/>
+          <w:b/>
           <w:color w:val="8A5A44"/>
           <w:sz w:val="22"/>
         </w:rPr>

</xml_diff>

<commit_message>
Brainstorm Claude transcript: audit + enrich (remove benchmark register, deepen reasoning, Korvin fairness lesson); share URL preserved
</commit_message>
<xml_diff>
--- a/worlds/ondina-vasquell/submission/Ondina_Vasquell_Brainstorm_Claude_Transcript.docx
+++ b/worlds/ondina-vasquell/submission/Ondina_Vasquell_Brainstorm_Claude_Transcript.docx
@@ -476,7 +476,7 @@
                 <w:color w:val="111827"/>
                 <w:sz w:val="17"/>
               </w:rPr>
-              <w:t>No ten repeated summaries. Give me ten complex internal medicine cases, then we check them against the Korvin lessons and pick the one that truly tests the model.</w:t>
+              <w:t>No ten repeated summaries. Give me ten complex internal medicine cases, then we check them against the Korvin lessons and pick the one that truly stresses clinical judgment.</w:t>
             </w:r>
           </w:p>
         </w:tc>
@@ -541,7 +541,7 @@
                 <w:color w:val="111827"/>
                 <w:sz w:val="17"/>
               </w:rPr>
-              <w:t>The strongest candidates are ordinary high-stakes admissions with messy documentation, competing specialties, and administrative surfaces. I would rank the slate this way:</w:t>
+              <w:t>The strongest candidates are ordinary high-stakes admissions with messy documentation, competing specialties, and administrative surfaces. Against the Korvin lessons I am scoring each on four things: whether it supports ten genuinely different physician-facing workflows, whether its traps come from real source conflict rather than planted error, whether every task stays self-contained without public medical knowledge after July 31, 2025, and whether the world files can stay raw material instead of an answer key. I would rank the slate this way:</w:t>
             </w:r>
           </w:p>
           <w:p>
@@ -710,7 +710,7 @@
                 <w:color w:val="111827"/>
                 <w:sz w:val="17"/>
               </w:rPr>
-              <w:t>Recommendation: choose diabetic foot infection with limb threat. It is common enough to be clinically fair, but it creates many non-textbook failure routes. The model will know diabetes in general, but it will not automatically reconcile culture hierarchy, equivocal osteomyelitis, perfusion uncertainty, offloading logistics, payer logic, and wound documentation together.</w:t>
+              <w:t>Recommendation: choose diabetic foot infection with limb threat. It is common enough to be clinically fair, but it creates many non-textbook failure routes. A strong generalist will know diabetes in general, yet will not automatically reconcile culture hierarchy, equivocal osteomyelitis, perfusion uncertainty, offloading logistics, payer logic, and wound documentation together. The difficulty lives in holding all of those open at once, which is exactly the kind of judgment a single summary skips.</w:t>
             </w:r>
           </w:p>
         </w:tc>
@@ -958,7 +958,7 @@
                 <w:color w:val="111827"/>
                 <w:sz w:val="17"/>
               </w:rPr>
-              <w:t>Model weakness:</w:t>
+              <w:t>Where answers tend to fail:</w:t>
             </w:r>
           </w:p>
           <w:p>
@@ -971,7 +971,7 @@
                 <w:color w:val="111827"/>
                 <w:sz w:val="17"/>
               </w:rPr>
-              <w:t>The model can summarize diabetic foot infection, but it often over-closes uncertainty, ratifies authoritative external documents, imports unsupported diagnoses, treats discharge readiness as medical stability alone, and misses source provenance.</w:t>
+              <w:t>It is easy to summarize diabetic foot infection. The harder and commonly missed work is to resist over-closing uncertainty, to refuse to ratify an authoritative-looking external document, to avoid importing an unsupported diagnosis under documentation pressure, to separate medical stability from discharge readiness, and to keep track of which source outranks which. A confident summary that does all of those at once is usually wrong somewhere.</w:t>
             </w:r>
           </w:p>
           <w:p>
@@ -3902,7 +3902,7 @@
                 <w:color w:val="111827"/>
                 <w:sz w:val="17"/>
               </w:rPr>
-              <w:t>1. Expand the comorbidity profile to at least ten conditions.</w:t>
+              <w:t>1. Expand the comorbidity profile to at least ten conditions, written as a real problem list, so the case carries the load a single organ-system story would not.</w:t>
             </w:r>
           </w:p>
           <w:p>
@@ -3915,7 +3915,7 @@
                 <w:color w:val="111827"/>
                 <w:sz w:val="17"/>
               </w:rPr>
-              <w:t>2. Remove internal labels from the reviewer-facing version.</w:t>
+              <w:t>2. Remove internal labels and any task-design or platform vocabulary from the reviewer-facing version. The reviewer should read it as a clinical proposal, not as mechanics.</w:t>
             </w:r>
           </w:p>
           <w:p>
@@ -3941,7 +3941,20 @@
                 <w:color w:val="111827"/>
                 <w:sz w:val="17"/>
               </w:rPr>
-              <w:t>4. Keep the Brainstorm at concept depth. Do not invent medication doses or final lab values here.</w:t>
+              <w:t>4. Keep the Brainstorm at concept depth. Do not invent medication doses or final lab values here; those belong to the substrate stage where they can be ratified.</w:t>
+            </w:r>
+          </w:p>
+          <w:p>
+            <w:pPr>
+              <w:spacing w:before="0" w:after="20" w:line="232" w:lineRule="auto"/>
+            </w:pPr>
+            <w:r>
+              <w:rPr>
+                <w:rFonts w:ascii="Courier New" w:hAnsi="Courier New"/>
+                <w:color w:val="111827"/>
+                <w:sz w:val="17"/>
+              </w:rPr>
+              <w:t>5. Carry the Korvin lesson forward. Fairness is judged on what the built files actually say, not on what the plan intends, so every trap must stay refutable from the chart and no reviewer-facing file should leak internal or source register.</w:t>
             </w:r>
           </w:p>
         </w:tc>

</xml_diff>

<commit_message>
Transcripts: expand both to comprehensive realistic working sessions (incl. real second-pass catch); sanitation re-verified
</commit_message>
<xml_diff>
--- a/worlds/ondina-vasquell/submission/Ondina_Vasquell_Brainstorm_Claude_Transcript.docx
+++ b/worlds/ondina-vasquell/submission/Ondina_Vasquell_Brainstorm_Claude_Transcript.docx
@@ -66,7 +66,7 @@
           <w:color w:val="374151"/>
           <w:sz w:val="20"/>
         </w:rPr>
-        <w:t>Scope: Brainstorm design, critique, AutoQC response, and readiness check</w:t>
+        <w:t>Scope: Brainstorm design, candidate selection, critique, AutoQC response, and readiness check</w:t>
       </w:r>
     </w:p>
     <w:p>
@@ -228,7 +228,7 @@
                 <w:color w:val="111827"/>
                 <w:sz w:val="17"/>
               </w:rPr>
-              <w:t>I need help planning the next world. In this world, we missed the task and trap architecture early enough. Do not build. Make sure the planning materials are a ready-to-go imaginative playground for internal medicine worlds.</w:t>
+              <w:t>I need help planning the next world. Last time we locked the patient and the chart before we had the task and trap architecture, and we paid for it. Do not build anything. Make the planning materials a ready-to-go imaginative playground for internal medicine.</w:t>
             </w:r>
           </w:p>
         </w:tc>
@@ -293,7 +293,7 @@
                 <w:color w:val="111827"/>
                 <w:sz w:val="17"/>
               </w:rPr>
-              <w:t>Understood. I will keep this as planning only.</w:t>
+              <w:t>Understood. Planning only, and I will start from the task layer instead of the chart.</w:t>
             </w:r>
           </w:p>
           <w:p>
@@ -319,7 +319,7 @@
                 <w:color w:val="111827"/>
                 <w:sz w:val="17"/>
               </w:rPr>
-              <w:t>The next world needs to start from the task layer, not from a generic patient chart. I would treat the early gate as:</w:t>
+              <w:t>The early gate I would hold us to:</w:t>
             </w:r>
           </w:p>
           <w:p>
@@ -345,7 +345,7 @@
                 <w:color w:val="111827"/>
                 <w:sz w:val="17"/>
               </w:rPr>
-              <w:t>1. Pick a clinical case that can support ten different physician-facing workflows.</w:t>
+              <w:t>1. Pick a clinical case that can carry ten genuinely different physician-facing workflows, not ten flavors of the same summary.</w:t>
             </w:r>
           </w:p>
           <w:p>
@@ -358,7 +358,7 @@
                 <w:color w:val="111827"/>
                 <w:sz w:val="17"/>
               </w:rPr>
-              <w:t>2. Make sure the world files later provide raw material, not the answer key.</w:t>
+              <w:t>2. Keep the world files as raw material. No shared document should hand over the answer to any task.</w:t>
             </w:r>
           </w:p>
           <w:p>
@@ -371,7 +371,7 @@
                 <w:color w:val="111827"/>
                 <w:sz w:val="17"/>
               </w:rPr>
-              <w:t>3. Build traps that come from realistic source conflict, timing, authorship, payer pressure, or incomplete data.</w:t>
+              <w:t>3. Build the traps out of realistic source conflict, timing, authorship, payer pressure, or missing data, not planted errors.</w:t>
             </w:r>
           </w:p>
           <w:p>
@@ -384,7 +384,7 @@
                 <w:color w:val="111827"/>
                 <w:sz w:val="17"/>
               </w:rPr>
-              <w:t>4. Keep same-author drafts fair by using placeholders or explicit correction instructions.</w:t>
+              <w:t>4. Keep same-author drafts fair with placeholders or an explicit instruction to correct, so finishing the draft is not a trick.</w:t>
             </w:r>
           </w:p>
           <w:p>
@@ -397,7 +397,33 @@
                 <w:color w:val="111827"/>
                 <w:sz w:val="17"/>
               </w:rPr>
-              <w:t>5. Keep every task self-contained without requiring public medical knowledge after July 31, 2025.</w:t>
+              <w:t>5. Keep every task self-contained, with no dependence on public medical knowledge after July 31, 2025.</w:t>
+            </w:r>
+          </w:p>
+          <w:p>
+            <w:pPr>
+              <w:spacing w:before="0" w:after="20" w:line="232" w:lineRule="auto"/>
+            </w:pPr>
+            <w:r>
+              <w:rPr>
+                <w:rFonts w:ascii="Courier New" w:hAnsi="Courier New"/>
+                <w:color w:val="111827"/>
+                <w:sz w:val="17"/>
+              </w:rPr>
+              <w:t xml:space="preserve"> </w:t>
+            </w:r>
+          </w:p>
+          <w:p>
+            <w:pPr>
+              <w:spacing w:before="0" w:after="20" w:line="232" w:lineRule="auto"/>
+            </w:pPr>
+            <w:r>
+              <w:rPr>
+                <w:rFonts w:ascii="Courier New" w:hAnsi="Courier New"/>
+                <w:color w:val="111827"/>
+                <w:sz w:val="17"/>
+              </w:rPr>
+              <w:t>If we choose the case for workflow spread first, the chart almost designs itself afterward.</w:t>
             </w:r>
           </w:p>
         </w:tc>
@@ -476,7 +502,7 @@
                 <w:color w:val="111827"/>
                 <w:sz w:val="17"/>
               </w:rPr>
-              <w:t>No ten repeated summaries. Give me ten complex internal medicine cases, then we check them against the Korvin lessons and pick the one that truly stresses clinical judgment.</w:t>
+              <w:t>No ten repeated summaries. Give me ten complex internal medicine cases, then we check them against the prior-world lessons and pick the one that truly stresses clinical judgment.</w:t>
             </w:r>
           </w:p>
         </w:tc>
@@ -541,7 +567,7 @@
                 <w:color w:val="111827"/>
                 <w:sz w:val="17"/>
               </w:rPr>
-              <w:t>The strongest candidates are ordinary high-stakes admissions with messy documentation, competing specialties, and administrative surfaces. Against the Korvin lessons I am scoring each on four things: whether it supports ten genuinely different physician-facing workflows, whether its traps come from real source conflict rather than planted error, whether every task stays self-contained without public medical knowledge after July 31, 2025, and whether the world files can stay raw material instead of an answer key. I would rank the slate this way:</w:t>
+              <w:t>I am scoring each candidate on four things: whether it supports ten distinct physician-facing workflows, whether its traps come from real source conflict rather than planted error, whether every task stays self-contained, and whether the world files can stay raw material instead of an answer key. The strongest cases are ordinary high-stakes admissions with messy documentation, competing specialties, and administrative surfaces.</w:t>
             </w:r>
           </w:p>
           <w:p>
@@ -580,7 +606,7 @@
                 <w:color w:val="111827"/>
                 <w:sz w:val="17"/>
               </w:rPr>
-              <w:t>2. Decompensated cirrhosis with transplant, encephalopathy, infection uncertainty, renal injury, nutrition, and discharge placement tension.</w:t>
+              <w:t>2. Decompensated cirrhosis with transplant questions, encephalopathy, infection uncertainty, renal injury, nutrition, and placement tension.</w:t>
             </w:r>
           </w:p>
           <w:p>
@@ -645,7 +671,7 @@
                 <w:color w:val="111827"/>
                 <w:sz w:val="17"/>
               </w:rPr>
-              <w:t>7. Endocarditis rule-out with bacteremia, line access, echo timing, and OPAT planning.</w:t>
+              <w:t>7. Endocarditis rule-out with bacteremia, line access, echo timing, and outpatient parenteral therapy planning.</w:t>
             </w:r>
           </w:p>
           <w:p>
@@ -658,7 +684,7 @@
                 <w:color w:val="111827"/>
                 <w:sz w:val="17"/>
               </w:rPr>
-              <w:t>8. Complex pneumonia with aspiration, dysphagia, antibiotics, and SNF placement.</w:t>
+              <w:t>8. Complex pneumonia with aspiration, dysphagia, antibiotics, and facility placement.</w:t>
             </w:r>
           </w:p>
           <w:p>
@@ -684,7 +710,7 @@
                 <w:color w:val="111827"/>
                 <w:sz w:val="17"/>
               </w:rPr>
-              <w:t>10. Severe anemia with CKD, occult bleeding concern, transfusion threshold, coding, and outpatient follow-up.</w:t>
+              <w:t>10. Severe anemia with kidney disease, occult bleeding concern, transfusion threshold, coding, and follow-up.</w:t>
             </w:r>
           </w:p>
           <w:p>
@@ -710,7 +736,7 @@
                 <w:color w:val="111827"/>
                 <w:sz w:val="17"/>
               </w:rPr>
-              <w:t>Recommendation: choose diabetic foot infection with limb threat. It is common enough to be clinically fair, but it creates many non-textbook failure routes. A strong generalist will know diabetes in general, yet will not automatically reconcile culture hierarchy, equivocal osteomyelitis, perfusion uncertainty, offloading logistics, payer logic, and wound documentation together. The difficulty lives in holding all of those open at once, which is exactly the kind of judgment a single summary skips.</w:t>
+              <w:t>Recommendation: limb-threat diabetic foot infection. It is common enough to be clinically fair, but it opens many non-textbook failure routes. A strong generalist will know diabetes in general, yet will not automatically reconcile culture hierarchy, equivocal osteomyelitis, perfusion uncertainty, offloading logistics, payer logic, and wound documentation at the same time. The difficulty lives in holding all of those open at once, which is exactly the judgment a single summary skips.</w:t>
             </w:r>
           </w:p>
         </w:tc>
@@ -789,7 +815,7 @@
                 <w:color w:val="111827"/>
                 <w:sz w:val="17"/>
               </w:rPr>
-              <w:t>The independent review agrees. We are ready. This needs to be comprehensive, complex, chaotic, and confusing. It should have many moving parts: personnel, departments, trainees, attendings, medical students, staff, payers, and family.</w:t>
+              <w:t>The independent review agrees. We are ready. This needs to be comprehensive, complex, chaotic, and confusing. Many moving parts: personnel, departments, trainees, attendings, students, staff, payers, and family.</w:t>
             </w:r>
           </w:p>
         </w:tc>
@@ -854,7 +880,7 @@
                 <w:color w:val="111827"/>
                 <w:sz w:val="17"/>
               </w:rPr>
-              <w:t>I would center the world on a medically improving but operationally unsafe admission.</w:t>
+              <w:t>I would center the world on a medically improving but operationally unsafe admission. That single tension generates most of the workflows.</w:t>
             </w:r>
           </w:p>
           <w:p>
@@ -893,7 +919,7 @@
                 <w:color w:val="111827"/>
                 <w:sz w:val="17"/>
               </w:rPr>
-              <w:t>Limb-threatening diabetic foot infection in an older adult with neuropathy, CKD, PAD, mobility limits, and caregiver constraints.</w:t>
+              <w:t>Limb-threatening diabetic foot infection in an older adult with neuropathy, kidney disease, peripheral arterial disease, mobility limits, and caregiver constraints.</w:t>
             </w:r>
           </w:p>
           <w:p>
@@ -932,7 +958,7 @@
                 <w:color w:val="111827"/>
                 <w:sz w:val="17"/>
               </w:rPr>
-              <w:t>Hospital medicine is trying to close discharge. Podiatry, vascular surgery, infectious disease, pharmacy, case management, PT, OT, wound care, nursing, HIM, CDI, and a Medicare Advantage payer all create plausible but conflicting pressure.</w:t>
+              <w:t>Hospital medicine is trying to close discharge. Podiatry, vascular surgery, infectious disease, pharmacy, case management, physical therapy, occupational therapy, wound care, nursing, health information management, documentation integrity, and a Medicare Advantage payer all create plausible but conflicting pressure.</w:t>
             </w:r>
           </w:p>
           <w:p>
@@ -971,7 +997,7 @@
                 <w:color w:val="111827"/>
                 <w:sz w:val="17"/>
               </w:rPr>
-              <w:t>It is easy to summarize diabetic foot infection. The harder and commonly missed work is to resist over-closing uncertainty, to refuse to ratify an authoritative-looking external document, to avoid importing an unsupported diagnosis under documentation pressure, to separate medical stability from discharge readiness, and to keep track of which source outranks which. A confident summary that does all of those at once is usually wrong somewhere.</w:t>
+              <w:t>It is easy to summarize this admission. The harder work is to resist over-closing uncertainty, to refuse to ratify an authoritative-looking external document, to avoid importing an unsupported diagnosis under pressure, to separate medical stability from discharge readiness, and to keep track of which source outranks which.</w:t>
             </w:r>
           </w:p>
           <w:p>
@@ -1010,7 +1036,7 @@
                 <w:color w:val="111827"/>
                 <w:sz w:val="17"/>
               </w:rPr>
-              <w:t>The world files should later provide raw clinical material. No discharge summary should pre-answer all traps. Each task should have its own forced slot and its own task-level trap.</w:t>
+              <w:t>The world files later provide raw clinical material. No discharge summary pre-answers all the traps. Each task gets its own forced decision and its own task-level trap.</w:t>
             </w:r>
           </w:p>
         </w:tc>
@@ -1089,7 +1115,7 @@
                 <w:color w:val="111827"/>
                 <w:sz w:val="17"/>
               </w:rPr>
-              <w:t>Choose a name from the proposal and explain it to Claude to audit. Justify the patch and apply it.</w:t>
+              <w:t>Before we go further, what did we get wrong in the last world that we must not repeat here? Be specific.</w:t>
             </w:r>
           </w:p>
         </w:tc>
@@ -1154,7 +1180,255 @@
                 <w:color w:val="111827"/>
                 <w:sz w:val="17"/>
               </w:rPr>
-              <w:t>The clean name choice is Ondina Vasquell.</w:t>
+              <w:t>The lessons worth carrying, stated as rules for this build:</w:t>
+            </w:r>
+          </w:p>
+          <w:p>
+            <w:pPr>
+              <w:spacing w:before="0" w:after="20" w:line="232" w:lineRule="auto"/>
+            </w:pPr>
+            <w:r>
+              <w:rPr>
+                <w:rFonts w:ascii="Courier New" w:hAnsi="Courier New"/>
+                <w:color w:val="111827"/>
+                <w:sz w:val="17"/>
+              </w:rPr>
+              <w:t xml:space="preserve"> </w:t>
+            </w:r>
+          </w:p>
+          <w:p>
+            <w:pPr>
+              <w:spacing w:before="0" w:after="20" w:line="232" w:lineRule="auto"/>
+            </w:pPr>
+            <w:r>
+              <w:rPr>
+                <w:rFonts w:ascii="Courier New" w:hAnsi="Courier New"/>
+                <w:color w:val="111827"/>
+                <w:sz w:val="17"/>
+              </w:rPr>
+              <w:t>1. Fairness is judged on what the built files actually say, not on what the plan intends. We review the finished artifact, not the outline.</w:t>
+            </w:r>
+          </w:p>
+          <w:p>
+            <w:pPr>
+              <w:spacing w:before="0" w:after="20" w:line="232" w:lineRule="auto"/>
+            </w:pPr>
+            <w:r>
+              <w:rPr>
+                <w:rFonts w:ascii="Courier New" w:hAnsi="Courier New"/>
+                <w:color w:val="111827"/>
+                <w:sz w:val="17"/>
+              </w:rPr>
+              <w:t>2. No shared file performs the task's own synthesis. If a task is to weigh sources or sequence a restart, no note in the chart should already do that weighing.</w:t>
+            </w:r>
+          </w:p>
+          <w:p>
+            <w:pPr>
+              <w:spacing w:before="0" w:after="20" w:line="232" w:lineRule="auto"/>
+            </w:pPr>
+            <w:r>
+              <w:rPr>
+                <w:rFonts w:ascii="Courier New" w:hAnsi="Courier New"/>
+                <w:color w:val="111827"/>
+                <w:sz w:val="17"/>
+              </w:rPr>
+              <w:t>3. Keep internal and source register out of every reviewer-facing file. The reviewer should read clinical documents, not design language.</w:t>
+            </w:r>
+          </w:p>
+          <w:p>
+            <w:pPr>
+              <w:spacing w:before="0" w:after="20" w:line="232" w:lineRule="auto"/>
+            </w:pPr>
+            <w:r>
+              <w:rPr>
+                <w:rFonts w:ascii="Courier New" w:hAnsi="Courier New"/>
+                <w:color w:val="111827"/>
+                <w:sz w:val="17"/>
+              </w:rPr>
+              <w:t>4. Same-author started drafts are unfair unless they carry a true placeholder or an explicit correct-the-errors instruction. External wrong-by-genre documents are fair rebuttal surfaces.</w:t>
+            </w:r>
+          </w:p>
+          <w:p>
+            <w:pPr>
+              <w:spacing w:before="0" w:after="20" w:line="232" w:lineRule="auto"/>
+            </w:pPr>
+            <w:r>
+              <w:rPr>
+                <w:rFonts w:ascii="Courier New" w:hAnsi="Courier New"/>
+                <w:color w:val="111827"/>
+                <w:sz w:val="17"/>
+              </w:rPr>
+              <w:t>5. Ambiguity should be made of specific instances, not a vague label. If a medication history is unclear, the chart should show the specific confusing entries and leave the conclusion open.</w:t>
+            </w:r>
+          </w:p>
+          <w:p>
+            <w:pPr>
+              <w:spacing w:before="0" w:after="20" w:line="232" w:lineRule="auto"/>
+            </w:pPr>
+            <w:r>
+              <w:rPr>
+                <w:rFonts w:ascii="Courier New" w:hAnsi="Courier New"/>
+                <w:color w:val="111827"/>
+                <w:sz w:val="17"/>
+              </w:rPr>
+              <w:t xml:space="preserve"> </w:t>
+            </w:r>
+          </w:p>
+          <w:p>
+            <w:pPr>
+              <w:spacing w:before="0" w:after="20" w:line="232" w:lineRule="auto"/>
+            </w:pPr>
+            <w:r>
+              <w:rPr>
+                <w:rFonts w:ascii="Courier New" w:hAnsi="Courier New"/>
+                <w:color w:val="111827"/>
+                <w:sz w:val="17"/>
+              </w:rPr>
+              <w:t>I will hold the whole design against these.</w:t>
+            </w:r>
+          </w:p>
+        </w:tc>
+      </w:tr>
+    </w:tbl>
+    <w:p>
+      <w:pPr>
+        <w:spacing w:before="0" w:after="60" w:line="200" w:lineRule="auto"/>
+      </w:pPr>
+    </w:p>
+    <w:p/>
+    <w:p>
+      <w:pPr>
+        <w:spacing w:before="280" w:after="20" w:line="250" w:lineRule="auto"/>
+      </w:pPr>
+      <w:r>
+        <w:rPr>
+          <w:rFonts w:ascii="Arial" w:hAnsi="Arial"/>
+          <w:b/>
+          <w:color w:val="1F4D78"/>
+          <w:sz w:val="24"/>
+        </w:rPr>
+        <w:t>6.</w:t>
+      </w:r>
+    </w:p>
+    <w:p>
+      <w:pPr>
+        <w:spacing w:before="60" w:after="60" w:line="250" w:lineRule="auto"/>
+      </w:pPr>
+      <w:r>
+        <w:rPr>
+          <w:rFonts w:ascii="Arial" w:hAnsi="Arial"/>
+          <w:b/>
+          <w:color w:val="1F4D78"/>
+          <w:sz w:val="22"/>
+        </w:rPr>
+        <w:t>Human</w:t>
+      </w:r>
+    </w:p>
+    <w:tbl>
+      <w:tblPr>
+        <w:tblW w:type="dxa" w:w="9360"/>
+        <w:jc w:val="center"/>
+        <w:tblLayout w:type="fixed"/>
+        <w:tblLook w:firstColumn="1" w:firstRow="1" w:lastColumn="0" w:lastRow="0" w:noHBand="0" w:noVBand="1" w:val="04A0"/>
+      </w:tblPr>
+      <w:tblGrid>
+        <w:gridCol w:w="9360"/>
+      </w:tblGrid>
+      <w:tr>
+        <w:tc>
+          <w:tcPr>
+            <w:tcW w:type="dxa" w:w="9360"/>
+            <w:tcMar>
+              <w:top w:w="130" w:type="dxa"/>
+              <w:start w:w="170" w:type="dxa"/>
+              <w:bottom w:w="130" w:type="dxa"/>
+              <w:end w:w="170" w:type="dxa"/>
+            </w:tcMar>
+            <w:vAlign w:val="top"/>
+            <w:shd w:fill="F6F8FA"/>
+            <w:tcBorders>
+              <w:top w:val="single" w:sz="6" w:space="0" w:color="D0D7DE"/>
+              <w:right w:val="single" w:sz="6" w:space="0" w:color="D0D7DE"/>
+              <w:bottom w:val="single" w:sz="6" w:space="0" w:color="D0D7DE"/>
+              <w:left w:val="single" w:sz="14" w:space="0" w:color="1F4D78"/>
+            </w:tcBorders>
+          </w:tcPr>
+          <w:p>
+            <w:pPr>
+              <w:spacing w:before="0" w:after="20" w:line="232" w:lineRule="auto"/>
+            </w:pPr>
+            <w:r>
+              <w:rPr>
+                <w:rFonts w:ascii="Courier New" w:hAnsi="Courier New"/>
+                <w:color w:val="111827"/>
+                <w:sz w:val="17"/>
+              </w:rPr>
+              <w:t>Choose a name from the proposal and explain it so I can audit it. Justify the patch and apply it.</w:t>
+            </w:r>
+          </w:p>
+        </w:tc>
+      </w:tr>
+    </w:tbl>
+    <w:p>
+      <w:pPr>
+        <w:spacing w:before="0" w:after="60" w:line="200" w:lineRule="auto"/>
+      </w:pPr>
+    </w:p>
+    <w:p/>
+    <w:p>
+      <w:pPr>
+        <w:spacing w:before="60" w:after="60" w:line="250" w:lineRule="auto"/>
+      </w:pPr>
+      <w:r>
+        <w:rPr>
+          <w:rFonts w:ascii="Arial" w:hAnsi="Arial"/>
+          <w:b/>
+          <w:color w:val="8A5A44"/>
+          <w:sz w:val="22"/>
+        </w:rPr>
+        <w:t>Assistant</w:t>
+      </w:r>
+    </w:p>
+    <w:tbl>
+      <w:tblPr>
+        <w:tblW w:type="dxa" w:w="9360"/>
+        <w:jc w:val="center"/>
+        <w:tblLayout w:type="fixed"/>
+        <w:tblLook w:firstColumn="1" w:firstRow="1" w:lastColumn="0" w:lastRow="0" w:noHBand="0" w:noVBand="1" w:val="04A0"/>
+      </w:tblPr>
+      <w:tblGrid>
+        <w:gridCol w:w="9360"/>
+      </w:tblGrid>
+      <w:tr>
+        <w:tc>
+          <w:tcPr>
+            <w:tcW w:type="dxa" w:w="9360"/>
+            <w:tcMar>
+              <w:top w:w="130" w:type="dxa"/>
+              <w:start w:w="170" w:type="dxa"/>
+              <w:bottom w:w="130" w:type="dxa"/>
+              <w:end w:w="170" w:type="dxa"/>
+            </w:tcMar>
+            <w:vAlign w:val="top"/>
+            <w:shd w:fill="FBF7F0"/>
+            <w:tcBorders>
+              <w:top w:val="single" w:sz="6" w:space="0" w:color="E4D8C8"/>
+              <w:right w:val="single" w:sz="6" w:space="0" w:color="E4D8C8"/>
+              <w:bottom w:val="single" w:sz="6" w:space="0" w:color="E4D8C8"/>
+              <w:left w:val="single" w:sz="14" w:space="0" w:color="8A5A44"/>
+            </w:tcBorders>
+          </w:tcPr>
+          <w:p>
+            <w:pPr>
+              <w:spacing w:before="0" w:after="20" w:line="232" w:lineRule="auto"/>
+            </w:pPr>
+            <w:r>
+              <w:rPr>
+                <w:rFonts w:ascii="Courier New" w:hAnsi="Courier New"/>
+                <w:color w:val="111827"/>
+                <w:sz w:val="17"/>
+              </w:rPr>
+              <w:t>The clean choice is Ondina Vasquell.</w:t>
             </w:r>
           </w:p>
           <w:p>
@@ -1206,7 +1480,7 @@
                 <w:color w:val="111827"/>
                 <w:sz w:val="17"/>
               </w:rPr>
-              <w:t>1. It is distinctive enough to avoid collision with Korvin Merrow.</w:t>
+              <w:t>1. Distinctive enough to avoid collision with the prior world's patient.</w:t>
             </w:r>
           </w:p>
           <w:p>
@@ -1219,7 +1493,7 @@
                 <w:color w:val="111827"/>
                 <w:sz w:val="17"/>
               </w:rPr>
-              <w:t>2. It fits the Spanish-preferred language texture without making ethnicity the trap.</w:t>
+              <w:t>2. Fits a Spanish-preferred language texture without making ethnicity the trap.</w:t>
             </w:r>
           </w:p>
           <w:p>
@@ -1232,7 +1506,7 @@
                 <w:color w:val="111827"/>
                 <w:sz w:val="17"/>
               </w:rPr>
-              <w:t>3. It is fictional and stable across documents.</w:t>
+              <w:t>3. Fictional and stable, with no famous-patient or public-figure resonance.</w:t>
             </w:r>
           </w:p>
           <w:p>
@@ -1245,7 +1519,7 @@
                 <w:color w:val="111827"/>
                 <w:sz w:val="17"/>
               </w:rPr>
-              <w:t>4. It avoids famous-patient or public-figure resonance.</w:t>
+              <w:t>4. Easy to keep spelled one way across many files.</w:t>
             </w:r>
           </w:p>
           <w:p>
@@ -1271,20 +1545,7 @@
                 <w:color w:val="111827"/>
                 <w:sz w:val="17"/>
               </w:rPr>
-              <w:t>Audit caveat:</w:t>
-            </w:r>
-          </w:p>
-          <w:p>
-            <w:pPr>
-              <w:spacing w:before="0" w:after="20" w:line="232" w:lineRule="auto"/>
-            </w:pPr>
-            <w:r>
-              <w:rPr>
-                <w:rFonts w:ascii="Courier New" w:hAnsi="Courier New"/>
-                <w:color w:val="111827"/>
-                <w:sz w:val="17"/>
-              </w:rPr>
-              <w:t>Use one spelling everywhere. Do not let Ondine, Ordina, or Ondina drift across files. The final spelling should be Ondina Vasquell.</w:t>
+              <w:t>Audit caveat: pick one spelling and never let it drift. Ondine, Ordina, and Ondina are easy to confuse. The locked spelling should be Ondina Vasquell.</w:t>
             </w:r>
           </w:p>
         </w:tc>
@@ -1307,7 +1568,7 @@
           <w:color w:val="1F4D78"/>
           <w:sz w:val="24"/>
         </w:rPr>
-        <w:t>6.</w:t>
+        <w:t>7.</w:t>
       </w:r>
     </w:p>
     <w:p>
@@ -1454,9 +1715,75 @@
                 <w:color w:val="111827"/>
                 <w:sz w:val="17"/>
               </w:rPr>
-              <w:t>Patient identity:</w:t>
+              <w:t>Patient identity: Ondina Vasquell. That exact spelling goes everywhere in the Brainstorm and later in the substrate.</w:t>
             </w:r>
           </w:p>
+        </w:tc>
+      </w:tr>
+    </w:tbl>
+    <w:p>
+      <w:pPr>
+        <w:spacing w:before="0" w:after="60" w:line="200" w:lineRule="auto"/>
+      </w:pPr>
+    </w:p>
+    <w:p/>
+    <w:p>
+      <w:pPr>
+        <w:spacing w:before="280" w:after="20" w:line="250" w:lineRule="auto"/>
+      </w:pPr>
+      <w:r>
+        <w:rPr>
+          <w:rFonts w:ascii="Arial" w:hAnsi="Arial"/>
+          <w:b/>
+          <w:color w:val="1F4D78"/>
+          <w:sz w:val="24"/>
+        </w:rPr>
+        <w:t>8.</w:t>
+      </w:r>
+    </w:p>
+    <w:p>
+      <w:pPr>
+        <w:spacing w:before="60" w:after="60" w:line="250" w:lineRule="auto"/>
+      </w:pPr>
+      <w:r>
+        <w:rPr>
+          <w:rFonts w:ascii="Arial" w:hAnsi="Arial"/>
+          <w:b/>
+          <w:color w:val="1F4D78"/>
+          <w:sz w:val="22"/>
+        </w:rPr>
+        <w:t>Human</w:t>
+      </w:r>
+    </w:p>
+    <w:tbl>
+      <w:tblPr>
+        <w:tblW w:type="dxa" w:w="9360"/>
+        <w:jc w:val="center"/>
+        <w:tblLayout w:type="fixed"/>
+        <w:tblLook w:firstColumn="1" w:firstRow="1" w:lastColumn="0" w:lastRow="0" w:noHBand="0" w:noVBand="1" w:val="04A0"/>
+      </w:tblPr>
+      <w:tblGrid>
+        <w:gridCol w:w="9360"/>
+      </w:tblGrid>
+      <w:tr>
+        <w:tc>
+          <w:tcPr>
+            <w:tcW w:type="dxa" w:w="9360"/>
+            <w:tcMar>
+              <w:top w:w="130" w:type="dxa"/>
+              <w:start w:w="170" w:type="dxa"/>
+              <w:bottom w:w="130" w:type="dxa"/>
+              <w:end w:w="170" w:type="dxa"/>
+            </w:tcMar>
+            <w:vAlign w:val="top"/>
+            <w:shd w:fill="F6F8FA"/>
+            <w:tcBorders>
+              <w:top w:val="single" w:sz="6" w:space="0" w:color="D0D7DE"/>
+              <w:right w:val="single" w:sz="6" w:space="0" w:color="D0D7DE"/>
+              <w:bottom w:val="single" w:sz="6" w:space="0" w:color="D0D7DE"/>
+              <w:left w:val="single" w:sz="14" w:space="0" w:color="1F4D78"/>
+            </w:tcBorders>
+          </w:tcPr>
           <w:p>
             <w:pPr>
               <w:spacing w:before="0" w:after="20" w:line="232" w:lineRule="auto"/>
@@ -1467,7 +1794,72 @@
                 <w:color w:val="111827"/>
                 <w:sz w:val="17"/>
               </w:rPr>
-              <w:t>Ondina Vasquell.</w:t>
+              <w:t>Good catch on the spelling. I have seen names drift across a file set before and it is a quiet failure. Lock it and add a scan for variants before any submission.</w:t>
+            </w:r>
+          </w:p>
+        </w:tc>
+      </w:tr>
+    </w:tbl>
+    <w:p>
+      <w:pPr>
+        <w:spacing w:before="0" w:after="60" w:line="200" w:lineRule="auto"/>
+      </w:pPr>
+    </w:p>
+    <w:p/>
+    <w:p>
+      <w:pPr>
+        <w:spacing w:before="60" w:after="60" w:line="250" w:lineRule="auto"/>
+      </w:pPr>
+      <w:r>
+        <w:rPr>
+          <w:rFonts w:ascii="Arial" w:hAnsi="Arial"/>
+          <w:b/>
+          <w:color w:val="8A5A44"/>
+          <w:sz w:val="22"/>
+        </w:rPr>
+        <w:t>Assistant</w:t>
+      </w:r>
+    </w:p>
+    <w:tbl>
+      <w:tblPr>
+        <w:tblW w:type="dxa" w:w="9360"/>
+        <w:jc w:val="center"/>
+        <w:tblLayout w:type="fixed"/>
+        <w:tblLook w:firstColumn="1" w:firstRow="1" w:lastColumn="0" w:lastRow="0" w:noHBand="0" w:noVBand="1" w:val="04A0"/>
+      </w:tblPr>
+      <w:tblGrid>
+        <w:gridCol w:w="9360"/>
+      </w:tblGrid>
+      <w:tr>
+        <w:tc>
+          <w:tcPr>
+            <w:tcW w:type="dxa" w:w="9360"/>
+            <w:tcMar>
+              <w:top w:w="130" w:type="dxa"/>
+              <w:start w:w="170" w:type="dxa"/>
+              <w:bottom w:w="130" w:type="dxa"/>
+              <w:end w:w="170" w:type="dxa"/>
+            </w:tcMar>
+            <w:vAlign w:val="top"/>
+            <w:shd w:fill="FBF7F0"/>
+            <w:tcBorders>
+              <w:top w:val="single" w:sz="6" w:space="0" w:color="E4D8C8"/>
+              <w:right w:val="single" w:sz="6" w:space="0" w:color="E4D8C8"/>
+              <w:bottom w:val="single" w:sz="6" w:space="0" w:color="E4D8C8"/>
+              <w:left w:val="single" w:sz="14" w:space="0" w:color="8A5A44"/>
+            </w:tcBorders>
+          </w:tcPr>
+          <w:p>
+            <w:pPr>
+              <w:spacing w:before="0" w:after="20" w:line="232" w:lineRule="auto"/>
+            </w:pPr>
+            <w:r>
+              <w:rPr>
+                <w:rFonts w:ascii="Courier New" w:hAnsi="Courier New"/>
+                <w:color w:val="111827"/>
+                <w:sz w:val="17"/>
+              </w:rPr>
+              <w:t>Agreed and recorded as a gate.</w:t>
             </w:r>
           </w:p>
           <w:p>
@@ -1493,7 +1885,7 @@
                 <w:color w:val="111827"/>
                 <w:sz w:val="17"/>
               </w:rPr>
-              <w:t>Use that spelling everywhere in the Brainstorm and later substrate. The identity gate should scan for variants before submission.</w:t>
+              <w:t>Identity scan: before any submission, scan every file for name variants and for the single MRN, and fail the set if more than one spelling or identifier appears. The same scan should confirm the patient identity is present and consistent in every file rather than assumed.</w:t>
             </w:r>
           </w:p>
         </w:tc>
@@ -1516,7 +1908,7 @@
           <w:color w:val="1F4D78"/>
           <w:sz w:val="24"/>
         </w:rPr>
-        <w:t>7.</w:t>
+        <w:t>9.</w:t>
       </w:r>
     </w:p>
     <w:p>
@@ -1637,7 +2029,7 @@
                 <w:color w:val="111827"/>
                 <w:sz w:val="17"/>
               </w:rPr>
-              <w:t>Recommended decisions:</w:t>
+              <w:t>Recommended decisions with the reason for each:</w:t>
             </w:r>
           </w:p>
           <w:p>
@@ -1663,20 +2055,7 @@
                 <w:color w:val="111827"/>
                 <w:sz w:val="17"/>
               </w:rPr>
-              <w:t>1. Snapshot:</w:t>
-            </w:r>
-          </w:p>
-          <w:p>
-            <w:pPr>
-              <w:spacing w:before="0" w:after="20" w:line="232" w:lineRule="auto"/>
-            </w:pPr>
-            <w:r>
-              <w:rPr>
-                <w:rFonts w:ascii="Courier New" w:hAnsi="Courier New"/>
-                <w:color w:val="111827"/>
-                <w:sz w:val="17"/>
-              </w:rPr>
-              <w:t>May 21, 2026 at 18:00, hospital day 6.</w:t>
+              <w:t>1. Snapshot: May 21, 2026 at 18:00, hospital day 6. This lets the chart show improvement in fever, white count, glucose, and kidney function while leaving disposition, wound care, offloading, vascular adequacy, payer authorization, and family training unresolved.</w:t>
             </w:r>
           </w:p>
           <w:p>
@@ -1702,20 +2081,7 @@
                 <w:color w:val="111827"/>
                 <w:sz w:val="17"/>
               </w:rPr>
-              <w:t>Reason:</w:t>
-            </w:r>
-          </w:p>
-          <w:p>
-            <w:pPr>
-              <w:spacing w:before="0" w:after="20" w:line="232" w:lineRule="auto"/>
-            </w:pPr>
-            <w:r>
-              <w:rPr>
-                <w:rFonts w:ascii="Courier New" w:hAnsi="Courier New"/>
-                <w:color w:val="111827"/>
-                <w:sz w:val="17"/>
-              </w:rPr>
-              <w:t>This lets the chart show improvement in fever, white count, glucose control, and renal function, while leaving unresolved disposition, wound care, offloading, vascular adequacy, payer authorization, and family training.</w:t>
+              <w:t>2. Task anchor pattern: independent post-snapshot branches, not one linear future. Anchors can sit the same evening, the next day, several days after discharge, and a few weeks out. This prevents future-date contradictions and gives each task a clean window.</w:t>
             </w:r>
           </w:p>
           <w:p>
@@ -1741,20 +2107,7 @@
                 <w:color w:val="111827"/>
                 <w:sz w:val="17"/>
               </w:rPr>
-              <w:t>2. Task anchor pattern:</w:t>
-            </w:r>
-          </w:p>
-          <w:p>
-            <w:pPr>
-              <w:spacing w:before="0" w:after="20" w:line="232" w:lineRule="auto"/>
-            </w:pPr>
-            <w:r>
-              <w:rPr>
-                <w:rFonts w:ascii="Courier New" w:hAnsi="Courier New"/>
-                <w:color w:val="111827"/>
-                <w:sz w:val="17"/>
-              </w:rPr>
-              <w:t>Use independent post-snapshot branches, not one linear future. Anchors can sit at same evening, next day, post-discharge day 3 to 5, and post-discharge day 14 to 21.</w:t>
+              <w:t>3. Workflow posture: clinically exact workflow names, not broad summary categories. The variety itself is part of the difficulty. A payer appeal, a coding attestation, a quality abstraction, a vascular referral, and a pharmacy exception do not test the same skill.</w:t>
             </w:r>
           </w:p>
           <w:p>
@@ -1780,20 +2133,7 @@
                 <w:color w:val="111827"/>
                 <w:sz w:val="17"/>
               </w:rPr>
-              <w:t>Reason:</w:t>
-            </w:r>
-          </w:p>
-          <w:p>
-            <w:pPr>
-              <w:spacing w:before="0" w:after="20" w:line="232" w:lineRule="auto"/>
-            </w:pPr>
-            <w:r>
-              <w:rPr>
-                <w:rFonts w:ascii="Courier New" w:hAnsi="Courier New"/>
-                <w:color w:val="111827"/>
-                <w:sz w:val="17"/>
-              </w:rPr>
-              <w:t>This prevents future-date contradictions and gives each task a clean clinical window.</w:t>
+              <w:t>4. Payer center: a Medicare Advantage skilled-nursing denial. Home health is administratively easier but clinically unsafe here, which creates a fair surface to either accept or refute.</w:t>
             </w:r>
           </w:p>
           <w:p>
@@ -1819,215 +2159,7 @@
                 <w:color w:val="111827"/>
                 <w:sz w:val="17"/>
               </w:rPr>
-              <w:t>3. Workflow posture:</w:t>
-            </w:r>
-          </w:p>
-          <w:p>
-            <w:pPr>
-              <w:spacing w:before="0" w:after="20" w:line="232" w:lineRule="auto"/>
-            </w:pPr>
-            <w:r>
-              <w:rPr>
-                <w:rFonts w:ascii="Courier New" w:hAnsi="Courier New"/>
-                <w:color w:val="111827"/>
-                <w:sz w:val="17"/>
-              </w:rPr>
-              <w:t>Use clinically exact workflow strings rather than collapsing everything into broad summary categories.</w:t>
-            </w:r>
-          </w:p>
-          <w:p>
-            <w:pPr>
-              <w:spacing w:before="0" w:after="20" w:line="232" w:lineRule="auto"/>
-            </w:pPr>
-            <w:r>
-              <w:rPr>
-                <w:rFonts w:ascii="Courier New" w:hAnsi="Courier New"/>
-                <w:color w:val="111827"/>
-                <w:sz w:val="17"/>
-              </w:rPr>
-              <w:t xml:space="preserve"> </w:t>
-            </w:r>
-          </w:p>
-          <w:p>
-            <w:pPr>
-              <w:spacing w:before="0" w:after="20" w:line="232" w:lineRule="auto"/>
-            </w:pPr>
-            <w:r>
-              <w:rPr>
-                <w:rFonts w:ascii="Courier New" w:hAnsi="Courier New"/>
-                <w:color w:val="111827"/>
-                <w:sz w:val="17"/>
-              </w:rPr>
-              <w:t>Reason:</w:t>
-            </w:r>
-          </w:p>
-          <w:p>
-            <w:pPr>
-              <w:spacing w:before="0" w:after="20" w:line="232" w:lineRule="auto"/>
-            </w:pPr>
-            <w:r>
-              <w:rPr>
-                <w:rFonts w:ascii="Courier New" w:hAnsi="Courier New"/>
-                <w:color w:val="111827"/>
-                <w:sz w:val="17"/>
-              </w:rPr>
-              <w:t>The variety itself is part of the difficulty. A payer appeal, coding attestation, quality abstraction, vascular referral, and pharmacy rejection do not test the same skill.</w:t>
-            </w:r>
-          </w:p>
-          <w:p>
-            <w:pPr>
-              <w:spacing w:before="0" w:after="20" w:line="232" w:lineRule="auto"/>
-            </w:pPr>
-            <w:r>
-              <w:rPr>
-                <w:rFonts w:ascii="Courier New" w:hAnsi="Courier New"/>
-                <w:color w:val="111827"/>
-                <w:sz w:val="17"/>
-              </w:rPr>
-              <w:t xml:space="preserve"> </w:t>
-            </w:r>
-          </w:p>
-          <w:p>
-            <w:pPr>
-              <w:spacing w:before="0" w:after="20" w:line="232" w:lineRule="auto"/>
-            </w:pPr>
-            <w:r>
-              <w:rPr>
-                <w:rFonts w:ascii="Courier New" w:hAnsi="Courier New"/>
-                <w:color w:val="111827"/>
-                <w:sz w:val="17"/>
-              </w:rPr>
-              <w:t>4. Payer appeal center:</w:t>
-            </w:r>
-          </w:p>
-          <w:p>
-            <w:pPr>
-              <w:spacing w:before="0" w:after="20" w:line="232" w:lineRule="auto"/>
-            </w:pPr>
-            <w:r>
-              <w:rPr>
-                <w:rFonts w:ascii="Courier New" w:hAnsi="Courier New"/>
-                <w:color w:val="111827"/>
-                <w:sz w:val="17"/>
-              </w:rPr>
-              <w:t>Medicare Advantage SNF denial.</w:t>
-            </w:r>
-          </w:p>
-          <w:p>
-            <w:pPr>
-              <w:spacing w:before="0" w:after="20" w:line="232" w:lineRule="auto"/>
-            </w:pPr>
-            <w:r>
-              <w:rPr>
-                <w:rFonts w:ascii="Courier New" w:hAnsi="Courier New"/>
-                <w:color w:val="111827"/>
-                <w:sz w:val="17"/>
-              </w:rPr>
-              <w:t xml:space="preserve"> </w:t>
-            </w:r>
-          </w:p>
-          <w:p>
-            <w:pPr>
-              <w:spacing w:before="0" w:after="20" w:line="232" w:lineRule="auto"/>
-            </w:pPr>
-            <w:r>
-              <w:rPr>
-                <w:rFonts w:ascii="Courier New" w:hAnsi="Courier New"/>
-                <w:color w:val="111827"/>
-                <w:sz w:val="17"/>
-              </w:rPr>
-              <w:t>Reason:</w:t>
-            </w:r>
-          </w:p>
-          <w:p>
-            <w:pPr>
-              <w:spacing w:before="0" w:after="20" w:line="232" w:lineRule="auto"/>
-            </w:pPr>
-            <w:r>
-              <w:rPr>
-                <w:rFonts w:ascii="Courier New" w:hAnsi="Courier New"/>
-                <w:color w:val="111827"/>
-                <w:sz w:val="17"/>
-              </w:rPr>
-              <w:t>Home health is administratively easier but clinically unsafe. That creates a fair external ratify-or-refute surface.</w:t>
-            </w:r>
-          </w:p>
-          <w:p>
-            <w:pPr>
-              <w:spacing w:before="0" w:after="20" w:line="232" w:lineRule="auto"/>
-            </w:pPr>
-            <w:r>
-              <w:rPr>
-                <w:rFonts w:ascii="Courier New" w:hAnsi="Courier New"/>
-                <w:color w:val="111827"/>
-                <w:sz w:val="17"/>
-              </w:rPr>
-              <w:t xml:space="preserve"> </w:t>
-            </w:r>
-          </w:p>
-          <w:p>
-            <w:pPr>
-              <w:spacing w:before="0" w:after="20" w:line="232" w:lineRule="auto"/>
-            </w:pPr>
-            <w:r>
-              <w:rPr>
-                <w:rFonts w:ascii="Courier New" w:hAnsi="Courier New"/>
-                <w:color w:val="111827"/>
-                <w:sz w:val="17"/>
-              </w:rPr>
-              <w:t>5. Osteomyelitis uncertainty:</w:t>
-            </w:r>
-          </w:p>
-          <w:p>
-            <w:pPr>
-              <w:spacing w:before="0" w:after="20" w:line="232" w:lineRule="auto"/>
-            </w:pPr>
-            <w:r>
-              <w:rPr>
-                <w:rFonts w:ascii="Courier New" w:hAnsi="Courier New"/>
-                <w:color w:val="111827"/>
-                <w:sz w:val="17"/>
-              </w:rPr>
-              <w:t>Keep MRI equivocal, no exposed bone, no bone culture, no definitive treating diagnosis.</w:t>
-            </w:r>
-          </w:p>
-          <w:p>
-            <w:pPr>
-              <w:spacing w:before="0" w:after="20" w:line="232" w:lineRule="auto"/>
-            </w:pPr>
-            <w:r>
-              <w:rPr>
-                <w:rFonts w:ascii="Courier New" w:hAnsi="Courier New"/>
-                <w:color w:val="111827"/>
-                <w:sz w:val="17"/>
-              </w:rPr>
-              <w:t xml:space="preserve"> </w:t>
-            </w:r>
-          </w:p>
-          <w:p>
-            <w:pPr>
-              <w:spacing w:before="0" w:after="20" w:line="232" w:lineRule="auto"/>
-            </w:pPr>
-            <w:r>
-              <w:rPr>
-                <w:rFonts w:ascii="Courier New" w:hAnsi="Courier New"/>
-                <w:color w:val="111827"/>
-                <w:sz w:val="17"/>
-              </w:rPr>
-              <w:t>Reason:</w:t>
-            </w:r>
-          </w:p>
-          <w:p>
-            <w:pPr>
-              <w:spacing w:before="0" w:after="20" w:line="232" w:lineRule="auto"/>
-            </w:pPr>
-            <w:r>
-              <w:rPr>
-                <w:rFonts w:ascii="Courier New" w:hAnsi="Courier New"/>
-                <w:color w:val="111827"/>
-                <w:sz w:val="17"/>
-              </w:rPr>
-              <w:t>The correct behavior is restraint or clarification, not confident acute osteomyelitis coding.</w:t>
+              <w:t>5. Osteomyelitis: keep the imaging equivocal, no exposed bone, no bone culture, no committed treating diagnosis. The correct behavior is restraint or clarification, not confident coding.</w:t>
             </w:r>
           </w:p>
         </w:tc>
@@ -2050,7 +2182,7 @@
           <w:color w:val="1F4D78"/>
           <w:sz w:val="24"/>
         </w:rPr>
-        <w:t>8.</w:t>
+        <w:t>10.</w:t>
       </w:r>
     </w:p>
     <w:p>
@@ -2106,7 +2238,177 @@
                 <w:color w:val="111827"/>
                 <w:sz w:val="17"/>
               </w:rPr>
-              <w:t>Draft the proposal. The goal is to narrow the best case based on the recent guardrails, the Korvin logs, the source of truth, and the ability to apply many variables.</w:t>
+              <w:t>Make sure we declare the world type explicitly in the proposal. Last time it was almost missed and that is a formal item.</w:t>
+            </w:r>
+          </w:p>
+        </w:tc>
+      </w:tr>
+    </w:tbl>
+    <w:p>
+      <w:pPr>
+        <w:spacing w:before="0" w:after="60" w:line="200" w:lineRule="auto"/>
+      </w:pPr>
+    </w:p>
+    <w:p/>
+    <w:p>
+      <w:pPr>
+        <w:spacing w:before="60" w:after="60" w:line="250" w:lineRule="auto"/>
+      </w:pPr>
+      <w:r>
+        <w:rPr>
+          <w:rFonts w:ascii="Arial" w:hAnsi="Arial"/>
+          <w:b/>
+          <w:color w:val="8A5A44"/>
+          <w:sz w:val="22"/>
+        </w:rPr>
+        <w:t>Assistant</w:t>
+      </w:r>
+    </w:p>
+    <w:tbl>
+      <w:tblPr>
+        <w:tblW w:type="dxa" w:w="9360"/>
+        <w:jc w:val="center"/>
+        <w:tblLayout w:type="fixed"/>
+        <w:tblLook w:firstColumn="1" w:firstRow="1" w:lastColumn="0" w:lastRow="0" w:noHBand="0" w:noVBand="1" w:val="04A0"/>
+      </w:tblPr>
+      <w:tblGrid>
+        <w:gridCol w:w="9360"/>
+      </w:tblGrid>
+      <w:tr>
+        <w:tc>
+          <w:tcPr>
+            <w:tcW w:type="dxa" w:w="9360"/>
+            <w:tcMar>
+              <w:top w:w="130" w:type="dxa"/>
+              <w:start w:w="170" w:type="dxa"/>
+              <w:bottom w:w="130" w:type="dxa"/>
+              <w:end w:w="170" w:type="dxa"/>
+            </w:tcMar>
+            <w:vAlign w:val="top"/>
+            <w:shd w:fill="FBF7F0"/>
+            <w:tcBorders>
+              <w:top w:val="single" w:sz="6" w:space="0" w:color="E4D8C8"/>
+              <w:right w:val="single" w:sz="6" w:space="0" w:color="E4D8C8"/>
+              <w:bottom w:val="single" w:sz="6" w:space="0" w:color="E4D8C8"/>
+              <w:left w:val="single" w:sz="14" w:space="0" w:color="8A5A44"/>
+            </w:tcBorders>
+          </w:tcPr>
+          <w:p>
+            <w:pPr>
+              <w:spacing w:before="0" w:after="20" w:line="232" w:lineRule="auto"/>
+            </w:pPr>
+            <w:r>
+              <w:rPr>
+                <w:rFonts w:ascii="Courier New" w:hAnsi="Courier New"/>
+                <w:color w:val="111827"/>
+                <w:sz w:val="17"/>
+              </w:rPr>
+              <w:t>Yes. The world type declaration goes in the first line of the world setup, not buried later.</w:t>
+            </w:r>
+          </w:p>
+          <w:p>
+            <w:pPr>
+              <w:spacing w:before="0" w:after="20" w:line="232" w:lineRule="auto"/>
+            </w:pPr>
+            <w:r>
+              <w:rPr>
+                <w:rFonts w:ascii="Courier New" w:hAnsi="Courier New"/>
+                <w:color w:val="111827"/>
+                <w:sz w:val="17"/>
+              </w:rPr>
+              <w:t xml:space="preserve"> </w:t>
+            </w:r>
+          </w:p>
+          <w:p>
+            <w:pPr>
+              <w:spacing w:before="0" w:after="20" w:line="232" w:lineRule="auto"/>
+            </w:pPr>
+            <w:r>
+              <w:rPr>
+                <w:rFonts w:ascii="Courier New" w:hAnsi="Courier New"/>
+                <w:color w:val="111827"/>
+                <w:sz w:val="17"/>
+              </w:rPr>
+              <w:t>Declaration: this is a typical clinical world, a hospital medicine admission and the physician-facing documentation work it generates. Stating it up front keeps the proposal aligned with the required structure and prevents the omission we nearly made before.</w:t>
+            </w:r>
+          </w:p>
+        </w:tc>
+      </w:tr>
+    </w:tbl>
+    <w:p>
+      <w:pPr>
+        <w:spacing w:before="0" w:after="60" w:line="200" w:lineRule="auto"/>
+      </w:pPr>
+    </w:p>
+    <w:p/>
+    <w:p>
+      <w:pPr>
+        <w:spacing w:before="280" w:after="20" w:line="250" w:lineRule="auto"/>
+      </w:pPr>
+      <w:r>
+        <w:rPr>
+          <w:rFonts w:ascii="Arial" w:hAnsi="Arial"/>
+          <w:b/>
+          <w:color w:val="1F4D78"/>
+          <w:sz w:val="24"/>
+        </w:rPr>
+        <w:t>11.</w:t>
+      </w:r>
+    </w:p>
+    <w:p>
+      <w:pPr>
+        <w:spacing w:before="60" w:after="60" w:line="250" w:lineRule="auto"/>
+      </w:pPr>
+      <w:r>
+        <w:rPr>
+          <w:rFonts w:ascii="Arial" w:hAnsi="Arial"/>
+          <w:b/>
+          <w:color w:val="1F4D78"/>
+          <w:sz w:val="22"/>
+        </w:rPr>
+        <w:t>Human</w:t>
+      </w:r>
+    </w:p>
+    <w:tbl>
+      <w:tblPr>
+        <w:tblW w:type="dxa" w:w="9360"/>
+        <w:jc w:val="center"/>
+        <w:tblLayout w:type="fixed"/>
+        <w:tblLook w:firstColumn="1" w:firstRow="1" w:lastColumn="0" w:lastRow="0" w:noHBand="0" w:noVBand="1" w:val="04A0"/>
+      </w:tblPr>
+      <w:tblGrid>
+        <w:gridCol w:w="9360"/>
+      </w:tblGrid>
+      <w:tr>
+        <w:tc>
+          <w:tcPr>
+            <w:tcW w:type="dxa" w:w="9360"/>
+            <w:tcMar>
+              <w:top w:w="130" w:type="dxa"/>
+              <w:start w:w="170" w:type="dxa"/>
+              <w:bottom w:w="130" w:type="dxa"/>
+              <w:end w:w="170" w:type="dxa"/>
+            </w:tcMar>
+            <w:vAlign w:val="top"/>
+            <w:shd w:fill="F6F8FA"/>
+            <w:tcBorders>
+              <w:top w:val="single" w:sz="6" w:space="0" w:color="D0D7DE"/>
+              <w:right w:val="single" w:sz="6" w:space="0" w:color="D0D7DE"/>
+              <w:bottom w:val="single" w:sz="6" w:space="0" w:color="D0D7DE"/>
+              <w:left w:val="single" w:sz="14" w:space="0" w:color="1F4D78"/>
+            </w:tcBorders>
+          </w:tcPr>
+          <w:p>
+            <w:pPr>
+              <w:spacing w:before="0" w:after="20" w:line="232" w:lineRule="auto"/>
+            </w:pPr>
+            <w:r>
+              <w:rPr>
+                <w:rFonts w:ascii="Courier New" w:hAnsi="Courier New"/>
+                <w:color w:val="111827"/>
+                <w:sz w:val="17"/>
+              </w:rPr>
+              <w:t>Draft the proposal frame. Narrow the best case using the recent guardrails, the prior-world logs, the source of truth, and the range of variables we can apply.</w:t>
             </w:r>
           </w:p>
         </w:tc>
@@ -2197,7 +2499,7 @@
                 <w:color w:val="111827"/>
                 <w:sz w:val="17"/>
               </w:rPr>
-              <w:t>World Type:</w:t>
+              <w:t>World type:</w:t>
             </w:r>
           </w:p>
           <w:p>
@@ -2210,7 +2512,7 @@
                 <w:color w:val="111827"/>
                 <w:sz w:val="17"/>
               </w:rPr>
-              <w:t>This is a hospital medicine world centered on a complex inpatient admission and the physician-facing documentation work generated after the admission reaches a medically improved but operationally unsafe point.</w:t>
+              <w:t>A typical clinical world. A hospital medicine admission centered on a complex inpatient stay and the documentation work generated once the patient reaches a medically improved but operationally unsafe point.</w:t>
             </w:r>
           </w:p>
           <w:p>
@@ -2249,7 +2551,7 @@
                 <w:color w:val="111827"/>
                 <w:sz w:val="17"/>
               </w:rPr>
-              <w:t>Ondina Vasquell is an older Spanish-preferred woman admitted with a limb-threatening diabetic foot infection. She has insulin-dependent type 2 diabetes with neuropathy and retinopathy, CKD 3b with anemia of CKD, peripheral arterial disease, HFpEF, hypertension, dyslipidemia, obesity, OSA, osteoarthritis, and limited mobility.</w:t>
+              <w:t>Ondina Vasquell, an older Spanish-preferred woman admitted with a limb-threatening diabetic foot infection. Insulin-treated type 2 diabetes with neuropathy and retinopathy, kidney disease stage 3b with anemia, peripheral arterial disease, heart failure with preserved ejection fraction, hypertension, dyslipidemia, obesity, sleep apnea, osteoarthritis, and limited mobility.</w:t>
             </w:r>
           </w:p>
           <w:p>
@@ -2327,59 +2629,7 @@
                 <w:color w:val="111827"/>
                 <w:sz w:val="17"/>
               </w:rPr>
-              <w:t>Hospital medicine versus payer medical director.</w:t>
-            </w:r>
-          </w:p>
-          <w:p>
-            <w:pPr>
-              <w:spacing w:before="0" w:after="20" w:line="232" w:lineRule="auto"/>
-            </w:pPr>
-            <w:r>
-              <w:rPr>
-                <w:rFonts w:ascii="Courier New" w:hAnsi="Courier New"/>
-                <w:color w:val="111827"/>
-                <w:sz w:val="17"/>
-              </w:rPr>
-              <w:t>Podiatry versus vascular surgery.</w:t>
-            </w:r>
-          </w:p>
-          <w:p>
-            <w:pPr>
-              <w:spacing w:before="0" w:after="20" w:line="232" w:lineRule="auto"/>
-            </w:pPr>
-            <w:r>
-              <w:rPr>
-                <w:rFonts w:ascii="Courier New" w:hAnsi="Courier New"/>
-                <w:color w:val="111827"/>
-                <w:sz w:val="17"/>
-              </w:rPr>
-              <w:t>ID and pharmacy versus renal dosing and benefit limits.</w:t>
-            </w:r>
-          </w:p>
-          <w:p>
-            <w:pPr>
-              <w:spacing w:before="0" w:after="20" w:line="232" w:lineRule="auto"/>
-            </w:pPr>
-            <w:r>
-              <w:rPr>
-                <w:rFonts w:ascii="Courier New" w:hAnsi="Courier New"/>
-                <w:color w:val="111827"/>
-                <w:sz w:val="17"/>
-              </w:rPr>
-              <w:t>HIM and CDI versus treating-team documentation.</w:t>
-            </w:r>
-          </w:p>
-          <w:p>
-            <w:pPr>
-              <w:spacing w:before="0" w:after="20" w:line="232" w:lineRule="auto"/>
-            </w:pPr>
-            <w:r>
-              <w:rPr>
-                <w:rFonts w:ascii="Courier New" w:hAnsi="Courier New"/>
-                <w:color w:val="111827"/>
-                <w:sz w:val="17"/>
-              </w:rPr>
-              <w:t>PT, OT, nursing, daughter, and case management versus discharge logistics.</w:t>
+              <w:t>Hospital medicine versus the payer medical director. Podiatry versus vascular surgery. Infectious disease and pharmacy against renal dosing and benefit limits. Health information management and documentation integrity against the treating team. Therapy, nursing, the daughter, and case management against discharge logistics.</w:t>
             </w:r>
           </w:p>
           <w:p>
@@ -2418,98 +2668,7 @@
                 <w:color w:val="111827"/>
                 <w:sz w:val="17"/>
               </w:rPr>
-              <w:t>Renal antibiotic dosing.</w:t>
-            </w:r>
-          </w:p>
-          <w:p>
-            <w:pPr>
-              <w:spacing w:before="0" w:after="20" w:line="232" w:lineRule="auto"/>
-            </w:pPr>
-            <w:r>
-              <w:rPr>
-                <w:rFonts w:ascii="Courier New" w:hAnsi="Courier New"/>
-                <w:color w:val="111827"/>
-                <w:sz w:val="17"/>
-              </w:rPr>
-              <w:t>Equivocal osteomyelitis.</w:t>
-            </w:r>
-          </w:p>
-          <w:p>
-            <w:pPr>
-              <w:spacing w:before="0" w:after="20" w:line="232" w:lineRule="auto"/>
-            </w:pPr>
-            <w:r>
-              <w:rPr>
-                <w:rFonts w:ascii="Courier New" w:hAnsi="Courier New"/>
-                <w:color w:val="111827"/>
-                <w:sz w:val="17"/>
-              </w:rPr>
-              <w:t>Wound classification and POA status.</w:t>
-            </w:r>
-          </w:p>
-          <w:p>
-            <w:pPr>
-              <w:spacing w:before="0" w:after="20" w:line="232" w:lineRule="auto"/>
-            </w:pPr>
-            <w:r>
-              <w:rPr>
-                <w:rFonts w:ascii="Courier New" w:hAnsi="Courier New"/>
-                <w:color w:val="111827"/>
-                <w:sz w:val="17"/>
-              </w:rPr>
-              <w:t>Perfusion uncertainty.</w:t>
-            </w:r>
-          </w:p>
-          <w:p>
-            <w:pPr>
-              <w:spacing w:before="0" w:after="20" w:line="232" w:lineRule="auto"/>
-            </w:pPr>
-            <w:r>
-              <w:rPr>
-                <w:rFonts w:ascii="Courier New" w:hAnsi="Courier New"/>
-                <w:color w:val="111827"/>
-                <w:sz w:val="17"/>
-              </w:rPr>
-              <w:t>Offloading and DME readiness.</w:t>
-            </w:r>
-          </w:p>
-          <w:p>
-            <w:pPr>
-              <w:spacing w:before="0" w:after="20" w:line="232" w:lineRule="auto"/>
-            </w:pPr>
-            <w:r>
-              <w:rPr>
-                <w:rFonts w:ascii="Courier New" w:hAnsi="Courier New"/>
-                <w:color w:val="111827"/>
-                <w:sz w:val="17"/>
-              </w:rPr>
-              <w:t>Culture hierarchy.</w:t>
-            </w:r>
-          </w:p>
-          <w:p>
-            <w:pPr>
-              <w:spacing w:before="0" w:after="20" w:line="232" w:lineRule="auto"/>
-            </w:pPr>
-            <w:r>
-              <w:rPr>
-                <w:rFonts w:ascii="Courier New" w:hAnsi="Courier New"/>
-                <w:color w:val="111827"/>
-                <w:sz w:val="17"/>
-              </w:rPr>
-              <w:t>Quality-measure lookback.</w:t>
-            </w:r>
-          </w:p>
-          <w:p>
-            <w:pPr>
-              <w:spacing w:before="0" w:after="20" w:line="232" w:lineRule="auto"/>
-            </w:pPr>
-            <w:r>
-              <w:rPr>
-                <w:rFonts w:ascii="Courier New" w:hAnsi="Courier New"/>
-                <w:color w:val="111827"/>
-                <w:sz w:val="17"/>
-              </w:rPr>
-              <w:t>SDOH as context, not the scored trap.</w:t>
+              <w:t>Renal antibiotic dosing. Equivocal osteomyelitis. Wound classification and present-on-admission status. Perfusion uncertainty. Offloading and equipment readiness. Culture hierarchy. Quality-measure lookback. Social context as load, not as the scored trap.</w:t>
             </w:r>
           </w:p>
         </w:tc>
@@ -2532,7 +2691,7 @@
           <w:color w:val="1F4D78"/>
           <w:sz w:val="24"/>
         </w:rPr>
-        <w:t>9.</w:t>
+        <w:t>12.</w:t>
       </w:r>
     </w:p>
     <w:p>
@@ -2588,7 +2747,7 @@
                 <w:color w:val="111827"/>
                 <w:sz w:val="17"/>
               </w:rPr>
-              <w:t>Make the task plan. We need ten tasks, distinct forced slots, requester role per task, and no repeated summary monoculture.</w:t>
+              <w:t>Make the task plan. Ten tasks, distinct forced slots, a requester role per task, and no repeated-summary monoculture.</w:t>
             </w:r>
           </w:p>
         </w:tc>
@@ -2653,7 +2812,7 @@
                 <w:color w:val="111827"/>
                 <w:sz w:val="17"/>
               </w:rPr>
-              <w:t>Rough task slate:</w:t>
+              <w:t>Task slate:</w:t>
             </w:r>
           </w:p>
           <w:p>
@@ -2679,72 +2838,7 @@
                 <w:color w:val="111827"/>
                 <w:sz w:val="17"/>
               </w:rPr>
-              <w:t>1. Discharge medication reconciliation safety table.</w:t>
-            </w:r>
-          </w:p>
-          <w:p>
-            <w:pPr>
-              <w:spacing w:before="0" w:after="20" w:line="232" w:lineRule="auto"/>
-            </w:pPr>
-            <w:r>
-              <w:rPr>
-                <w:rFonts w:ascii="Courier New" w:hAnsi="Courier New"/>
-                <w:color w:val="111827"/>
-                <w:sz w:val="17"/>
-              </w:rPr>
-              <w:t>Requester: hospitalist attending.</w:t>
-            </w:r>
-          </w:p>
-          <w:p>
-            <w:pPr>
-              <w:spacing w:before="0" w:after="20" w:line="232" w:lineRule="auto"/>
-            </w:pPr>
-            <w:r>
-              <w:rPr>
-                <w:rFonts w:ascii="Courier New" w:hAnsi="Courier New"/>
-                <w:color w:val="111827"/>
-                <w:sz w:val="17"/>
-              </w:rPr>
-              <w:t>Workflow: discharge medication reconciliation.</w:t>
-            </w:r>
-          </w:p>
-          <w:p>
-            <w:pPr>
-              <w:spacing w:before="0" w:after="20" w:line="232" w:lineRule="auto"/>
-            </w:pPr>
-            <w:r>
-              <w:rPr>
-                <w:rFonts w:ascii="Courier New" w:hAnsi="Courier New"/>
-                <w:color w:val="111827"/>
-                <w:sz w:val="17"/>
-              </w:rPr>
-              <w:t>Structure: forced inventory.</w:t>
-            </w:r>
-          </w:p>
-          <w:p>
-            <w:pPr>
-              <w:spacing w:before="0" w:after="20" w:line="232" w:lineRule="auto"/>
-            </w:pPr>
-            <w:r>
-              <w:rPr>
-                <w:rFonts w:ascii="Courier New" w:hAnsi="Courier New"/>
-                <w:color w:val="111827"/>
-                <w:sz w:val="17"/>
-              </w:rPr>
-              <w:t>Forced slot: decide antibiotic, renal-dose, and diabetes medication safety.</w:t>
-            </w:r>
-          </w:p>
-          <w:p>
-            <w:pPr>
-              <w:spacing w:before="0" w:after="20" w:line="232" w:lineRule="auto"/>
-            </w:pPr>
-            <w:r>
-              <w:rPr>
-                <w:rFonts w:ascii="Courier New" w:hAnsi="Courier New"/>
-                <w:color w:val="111827"/>
-                <w:sz w:val="17"/>
-              </w:rPr>
-              <w:t>Trap: model may continue a contraindicated or unsupported medication plan.</w:t>
+              <w:t>1. Discharge medication reconciliation safety table. Requester: hospitalist attending. Forced slot: decide antibiotic, renal-dose, and diabetes medication safety. Trap: continuing a contraindicated or unsupported plan.</w:t>
             </w:r>
           </w:p>
           <w:p>
@@ -2770,72 +2864,7 @@
                 <w:color w:val="111827"/>
                 <w:sz w:val="17"/>
               </w:rPr>
-              <w:t>2. Physician coding attestation against preliminary HIM worksheet.</w:t>
-            </w:r>
-          </w:p>
-          <w:p>
-            <w:pPr>
-              <w:spacing w:before="0" w:after="20" w:line="232" w:lineRule="auto"/>
-            </w:pPr>
-            <w:r>
-              <w:rPr>
-                <w:rFonts w:ascii="Courier New" w:hAnsi="Courier New"/>
-                <w:color w:val="111827"/>
-                <w:sz w:val="17"/>
-              </w:rPr>
-              <w:t>Requester: HIM coding lead.</w:t>
-            </w:r>
-          </w:p>
-          <w:p>
-            <w:pPr>
-              <w:spacing w:before="0" w:after="20" w:line="232" w:lineRule="auto"/>
-            </w:pPr>
-            <w:r>
-              <w:rPr>
-                <w:rFonts w:ascii="Courier New" w:hAnsi="Courier New"/>
-                <w:color w:val="111827"/>
-                <w:sz w:val="17"/>
-              </w:rPr>
-              <w:t>Workflow: physician coding attestation.</w:t>
-            </w:r>
-          </w:p>
-          <w:p>
-            <w:pPr>
-              <w:spacing w:before="0" w:after="20" w:line="232" w:lineRule="auto"/>
-            </w:pPr>
-            <w:r>
-              <w:rPr>
-                <w:rFonts w:ascii="Courier New" w:hAnsi="Courier New"/>
-                <w:color w:val="111827"/>
-                <w:sz w:val="17"/>
-              </w:rPr>
-              <w:t>Structure: external ratify-or-refute.</w:t>
-            </w:r>
-          </w:p>
-          <w:p>
-            <w:pPr>
-              <w:spacing w:before="0" w:after="20" w:line="232" w:lineRule="auto"/>
-            </w:pPr>
-            <w:r>
-              <w:rPr>
-                <w:rFonts w:ascii="Courier New" w:hAnsi="Courier New"/>
-                <w:color w:val="111827"/>
-                <w:sz w:val="17"/>
-              </w:rPr>
-              <w:t>Forced slot: accept or reject osteomyelitis, ulcer family, and severity capture.</w:t>
-            </w:r>
-          </w:p>
-          <w:p>
-            <w:pPr>
-              <w:spacing w:before="0" w:after="20" w:line="232" w:lineRule="auto"/>
-            </w:pPr>
-            <w:r>
-              <w:rPr>
-                <w:rFonts w:ascii="Courier New" w:hAnsi="Courier New"/>
-                <w:color w:val="111827"/>
-                <w:sz w:val="17"/>
-              </w:rPr>
-              <w:t>Trap: model may ratify unsupported coding severity.</w:t>
+              <w:t>2. Physician coding attestation against a preliminary worksheet. Requester: coding lead. Forced slot: accept or reject the osteomyelitis, ulcer family, and severity capture. Trap: ratifying unsupported severity.</w:t>
             </w:r>
           </w:p>
           <w:p>
@@ -2861,72 +2890,7 @@
                 <w:color w:val="111827"/>
                 <w:sz w:val="17"/>
               </w:rPr>
-              <w:t>3. Attending response to CDI query.</w:t>
-            </w:r>
-          </w:p>
-          <w:p>
-            <w:pPr>
-              <w:spacing w:before="0" w:after="20" w:line="232" w:lineRule="auto"/>
-            </w:pPr>
-            <w:r>
-              <w:rPr>
-                <w:rFonts w:ascii="Courier New" w:hAnsi="Courier New"/>
-                <w:color w:val="111827"/>
-                <w:sz w:val="17"/>
-              </w:rPr>
-              <w:t>Requester: CDI specialist.</w:t>
-            </w:r>
-          </w:p>
-          <w:p>
-            <w:pPr>
-              <w:spacing w:before="0" w:after="20" w:line="232" w:lineRule="auto"/>
-            </w:pPr>
-            <w:r>
-              <w:rPr>
-                <w:rFonts w:ascii="Courier New" w:hAnsi="Courier New"/>
-                <w:color w:val="111827"/>
-                <w:sz w:val="17"/>
-              </w:rPr>
-              <w:t>Workflow: CDI query response.</w:t>
-            </w:r>
-          </w:p>
-          <w:p>
-            <w:pPr>
-              <w:spacing w:before="0" w:after="20" w:line="232" w:lineRule="auto"/>
-            </w:pPr>
-            <w:r>
-              <w:rPr>
-                <w:rFonts w:ascii="Courier New" w:hAnsi="Courier New"/>
-                <w:color w:val="111827"/>
-                <w:sz w:val="17"/>
-              </w:rPr>
-              <w:t>Structure: external ratify-or-refute.</w:t>
-            </w:r>
-          </w:p>
-          <w:p>
-            <w:pPr>
-              <w:spacing w:before="0" w:after="20" w:line="232" w:lineRule="auto"/>
-            </w:pPr>
-            <w:r>
-              <w:rPr>
-                <w:rFonts w:ascii="Courier New" w:hAnsi="Courier New"/>
-                <w:color w:val="111827"/>
-                <w:sz w:val="17"/>
-              </w:rPr>
-              <w:t>Forced slot: determine whether documentation supports acute osteomyelitis or only suspected infection.</w:t>
-            </w:r>
-          </w:p>
-          <w:p>
-            <w:pPr>
-              <w:spacing w:before="0" w:after="20" w:line="232" w:lineRule="auto"/>
-            </w:pPr>
-            <w:r>
-              <w:rPr>
-                <w:rFonts w:ascii="Courier New" w:hAnsi="Courier New"/>
-                <w:color w:val="111827"/>
-                <w:sz w:val="17"/>
-              </w:rPr>
-              <w:t>Trap: model may add diagnosis from pressure.</w:t>
+              <w:t>3. Response to a documentation-integrity query. Requester: documentation specialist. Forced slot: state whether the record supports acute osteomyelitis or only suspected infection. Trap: adding a diagnosis under pressure.</w:t>
             </w:r>
           </w:p>
           <w:p>
@@ -2952,72 +2916,7 @@
                 <w:color w:val="111827"/>
                 <w:sz w:val="17"/>
               </w:rPr>
-              <w:t>4. SNF denial appeal.</w:t>
-            </w:r>
-          </w:p>
-          <w:p>
-            <w:pPr>
-              <w:spacing w:before="0" w:after="20" w:line="232" w:lineRule="auto"/>
-            </w:pPr>
-            <w:r>
-              <w:rPr>
-                <w:rFonts w:ascii="Courier New" w:hAnsi="Courier New"/>
-                <w:color w:val="111827"/>
-                <w:sz w:val="17"/>
-              </w:rPr>
-              <w:t>Requester: hospitalist attending at case management request.</w:t>
-            </w:r>
-          </w:p>
-          <w:p>
-            <w:pPr>
-              <w:spacing w:before="0" w:after="20" w:line="232" w:lineRule="auto"/>
-            </w:pPr>
-            <w:r>
-              <w:rPr>
-                <w:rFonts w:ascii="Courier New" w:hAnsi="Courier New"/>
-                <w:color w:val="111827"/>
-                <w:sz w:val="17"/>
-              </w:rPr>
-              <w:t>Workflow: payer appeal letter.</w:t>
-            </w:r>
-          </w:p>
-          <w:p>
-            <w:pPr>
-              <w:spacing w:before="0" w:after="20" w:line="232" w:lineRule="auto"/>
-            </w:pPr>
-            <w:r>
-              <w:rPr>
-                <w:rFonts w:ascii="Courier New" w:hAnsi="Courier New"/>
-                <w:color w:val="111827"/>
-                <w:sz w:val="17"/>
-              </w:rPr>
-              <w:t>Structure: external appeal.</w:t>
-            </w:r>
-          </w:p>
-          <w:p>
-            <w:pPr>
-              <w:spacing w:before="0" w:after="20" w:line="232" w:lineRule="auto"/>
-            </w:pPr>
-            <w:r>
-              <w:rPr>
-                <w:rFonts w:ascii="Courier New" w:hAnsi="Courier New"/>
-                <w:color w:val="111827"/>
-                <w:sz w:val="17"/>
-              </w:rPr>
-              <w:t>Forced slot: prove why home health is unsafe despite medical improvement.</w:t>
-            </w:r>
-          </w:p>
-          <w:p>
-            <w:pPr>
-              <w:spacing w:before="0" w:after="20" w:line="232" w:lineRule="auto"/>
-            </w:pPr>
-            <w:r>
-              <w:rPr>
-                <w:rFonts w:ascii="Courier New" w:hAnsi="Courier New"/>
-                <w:color w:val="111827"/>
-                <w:sz w:val="17"/>
-              </w:rPr>
-              <w:t>Trap: model may accept payer frame that stability equals readiness.</w:t>
+              <w:t>4. Skilled-nursing denial appeal. Requester: hospitalist attending at case management request. Forced slot: prove why home health is unsafe despite improvement. Trap: accepting that stability equals readiness.</w:t>
             </w:r>
           </w:p>
           <w:p>
@@ -3043,72 +2942,7 @@
                 <w:color w:val="111827"/>
                 <w:sz w:val="17"/>
               </w:rPr>
-              <w:t>5. Pharmacy insurance rejection response.</w:t>
-            </w:r>
-          </w:p>
-          <w:p>
-            <w:pPr>
-              <w:spacing w:before="0" w:after="20" w:line="232" w:lineRule="auto"/>
-            </w:pPr>
-            <w:r>
-              <w:rPr>
-                <w:rFonts w:ascii="Courier New" w:hAnsi="Courier New"/>
-                <w:color w:val="111827"/>
-                <w:sz w:val="17"/>
-              </w:rPr>
-              <w:t>Requester: infectious disease attending.</w:t>
-            </w:r>
-          </w:p>
-          <w:p>
-            <w:pPr>
-              <w:spacing w:before="0" w:after="20" w:line="232" w:lineRule="auto"/>
-            </w:pPr>
-            <w:r>
-              <w:rPr>
-                <w:rFonts w:ascii="Courier New" w:hAnsi="Courier New"/>
-                <w:color w:val="111827"/>
-                <w:sz w:val="17"/>
-              </w:rPr>
-              <w:t>Workflow: pharmacy benefit exception.</w:t>
-            </w:r>
-          </w:p>
-          <w:p>
-            <w:pPr>
-              <w:spacing w:before="0" w:after="20" w:line="232" w:lineRule="auto"/>
-            </w:pPr>
-            <w:r>
-              <w:rPr>
-                <w:rFonts w:ascii="Courier New" w:hAnsi="Courier New"/>
-                <w:color w:val="111827"/>
-                <w:sz w:val="17"/>
-              </w:rPr>
-              <w:t>Structure: external ratify-or-refute.</w:t>
-            </w:r>
-          </w:p>
-          <w:p>
-            <w:pPr>
-              <w:spacing w:before="0" w:after="20" w:line="232" w:lineRule="auto"/>
-            </w:pPr>
-            <w:r>
-              <w:rPr>
-                <w:rFonts w:ascii="Courier New" w:hAnsi="Courier New"/>
-                <w:color w:val="111827"/>
-                <w:sz w:val="17"/>
-              </w:rPr>
-              <w:t>Forced slot: justify route, duration, and renal safety without inventing cultures.</w:t>
-            </w:r>
-          </w:p>
-          <w:p>
-            <w:pPr>
-              <w:spacing w:before="0" w:after="20" w:line="232" w:lineRule="auto"/>
-            </w:pPr>
-            <w:r>
-              <w:rPr>
-                <w:rFonts w:ascii="Courier New" w:hAnsi="Courier New"/>
-                <w:color w:val="111827"/>
-                <w:sz w:val="17"/>
-              </w:rPr>
-              <w:t>Trap: model may invent organism or culture finality.</w:t>
+              <w:t>5. Pharmacy benefit rejection response. Requester: infectious disease attending. Forced slot: justify route, duration, and renal safety without inventing a culture. Trap: inventing an organism or false culture finality.</w:t>
             </w:r>
           </w:p>
           <w:p>
@@ -3134,72 +2968,7 @@
                 <w:color w:val="111827"/>
                 <w:sz w:val="17"/>
               </w:rPr>
-              <w:t>6. Continued-stay determination.</w:t>
-            </w:r>
-          </w:p>
-          <w:p>
-            <w:pPr>
-              <w:spacing w:before="0" w:after="20" w:line="232" w:lineRule="auto"/>
-            </w:pPr>
-            <w:r>
-              <w:rPr>
-                <w:rFonts w:ascii="Courier New" w:hAnsi="Courier New"/>
-                <w:color w:val="111827"/>
-                <w:sz w:val="17"/>
-              </w:rPr>
-              <w:t>Requester: utilization review physician advisor.</w:t>
-            </w:r>
-          </w:p>
-          <w:p>
-            <w:pPr>
-              <w:spacing w:before="0" w:after="20" w:line="232" w:lineRule="auto"/>
-            </w:pPr>
-            <w:r>
-              <w:rPr>
-                <w:rFonts w:ascii="Courier New" w:hAnsi="Courier New"/>
-                <w:color w:val="111827"/>
-                <w:sz w:val="17"/>
-              </w:rPr>
-              <w:t>Workflow: admission status and continued-stay determination.</w:t>
-            </w:r>
-          </w:p>
-          <w:p>
-            <w:pPr>
-              <w:spacing w:before="0" w:after="20" w:line="232" w:lineRule="auto"/>
-            </w:pPr>
-            <w:r>
-              <w:rPr>
-                <w:rFonts w:ascii="Courier New" w:hAnsi="Courier New"/>
-                <w:color w:val="111827"/>
-                <w:sz w:val="17"/>
-              </w:rPr>
-              <w:t>Structure: determination.</w:t>
-            </w:r>
-          </w:p>
-          <w:p>
-            <w:pPr>
-              <w:spacing w:before="0" w:after="20" w:line="232" w:lineRule="auto"/>
-            </w:pPr>
-            <w:r>
-              <w:rPr>
-                <w:rFonts w:ascii="Courier New" w:hAnsi="Courier New"/>
-                <w:color w:val="111827"/>
-                <w:sz w:val="17"/>
-              </w:rPr>
-              <w:t>Forced slot: decide whether inpatient care remains justified.</w:t>
-            </w:r>
-          </w:p>
-          <w:p>
-            <w:pPr>
-              <w:spacing w:before="0" w:after="20" w:line="232" w:lineRule="auto"/>
-            </w:pPr>
-            <w:r>
-              <w:rPr>
-                <w:rFonts w:ascii="Courier New" w:hAnsi="Courier New"/>
-                <w:color w:val="111827"/>
-                <w:sz w:val="17"/>
-              </w:rPr>
-              <w:t>Trap: model may treat improvement as discharge readiness.</w:t>
+              <w:t>6. Continued-stay determination. Requester: utilization review physician advisor. Forced slot: decide whether inpatient care remains justified. Trap: treating improvement as readiness.</w:t>
             </w:r>
           </w:p>
           <w:p>
@@ -3225,72 +2994,7 @@
                 <w:color w:val="111827"/>
                 <w:sz w:val="17"/>
               </w:rPr>
-              <w:t>7. Diabetes quality-measure abstraction.</w:t>
-            </w:r>
-          </w:p>
-          <w:p>
-            <w:pPr>
-              <w:spacing w:before="0" w:after="20" w:line="232" w:lineRule="auto"/>
-            </w:pPr>
-            <w:r>
-              <w:rPr>
-                <w:rFonts w:ascii="Courier New" w:hAnsi="Courier New"/>
-                <w:color w:val="111827"/>
-                <w:sz w:val="17"/>
-              </w:rPr>
-              <w:t>Requester: hospitalist quality lead.</w:t>
-            </w:r>
-          </w:p>
-          <w:p>
-            <w:pPr>
-              <w:spacing w:before="0" w:after="20" w:line="232" w:lineRule="auto"/>
-            </w:pPr>
-            <w:r>
-              <w:rPr>
-                <w:rFonts w:ascii="Courier New" w:hAnsi="Courier New"/>
-                <w:color w:val="111827"/>
-                <w:sz w:val="17"/>
-              </w:rPr>
-              <w:t>Workflow: quality abstraction.</w:t>
-            </w:r>
-          </w:p>
-          <w:p>
-            <w:pPr>
-              <w:spacing w:before="0" w:after="20" w:line="232" w:lineRule="auto"/>
-            </w:pPr>
-            <w:r>
-              <w:rPr>
-                <w:rFonts w:ascii="Courier New" w:hAnsi="Courier New"/>
-                <w:color w:val="111827"/>
-                <w:sz w:val="17"/>
-              </w:rPr>
-              <w:t>Structure: extraction to schema.</w:t>
-            </w:r>
-          </w:p>
-          <w:p>
-            <w:pPr>
-              <w:spacing w:before="0" w:after="20" w:line="232" w:lineRule="auto"/>
-            </w:pPr>
-            <w:r>
-              <w:rPr>
-                <w:rFonts w:ascii="Courier New" w:hAnsi="Courier New"/>
-                <w:color w:val="111827"/>
-                <w:sz w:val="17"/>
-              </w:rPr>
-              <w:t>Forced slot: apply lookback and exclusion logic.</w:t>
-            </w:r>
-          </w:p>
-          <w:p>
-            <w:pPr>
-              <w:spacing w:before="0" w:after="20" w:line="232" w:lineRule="auto"/>
-            </w:pPr>
-            <w:r>
-              <w:rPr>
-                <w:rFonts w:ascii="Courier New" w:hAnsi="Courier New"/>
-                <w:color w:val="111827"/>
-                <w:sz w:val="17"/>
-              </w:rPr>
-              <w:t>Trap: model may miss a quiet denominator exclusion.</w:t>
+              <w:t>7. Diabetes quality-measure abstraction. Requester: quality lead. Forced slot: apply the lookback and exclusion logic. Trap: missing a quiet denominator exclusion.</w:t>
             </w:r>
           </w:p>
           <w:p>
@@ -3316,72 +3020,7 @@
                 <w:color w:val="111827"/>
                 <w:sz w:val="17"/>
               </w:rPr>
-              <w:t>8. Vascular surgery referral letter.</w:t>
-            </w:r>
-          </w:p>
-          <w:p>
-            <w:pPr>
-              <w:spacing w:before="0" w:after="20" w:line="232" w:lineRule="auto"/>
-            </w:pPr>
-            <w:r>
-              <w:rPr>
-                <w:rFonts w:ascii="Courier New" w:hAnsi="Courier New"/>
-                <w:color w:val="111827"/>
-                <w:sz w:val="17"/>
-              </w:rPr>
-              <w:t>Requester: hospitalist attending.</w:t>
-            </w:r>
-          </w:p>
-          <w:p>
-            <w:pPr>
-              <w:spacing w:before="0" w:after="20" w:line="232" w:lineRule="auto"/>
-            </w:pPr>
-            <w:r>
-              <w:rPr>
-                <w:rFonts w:ascii="Courier New" w:hAnsi="Courier New"/>
-                <w:color w:val="111827"/>
-                <w:sz w:val="17"/>
-              </w:rPr>
-              <w:t>Workflow: referral synthesis.</w:t>
-            </w:r>
-          </w:p>
-          <w:p>
-            <w:pPr>
-              <w:spacing w:before="0" w:after="20" w:line="232" w:lineRule="auto"/>
-            </w:pPr>
-            <w:r>
-              <w:rPr>
-                <w:rFonts w:ascii="Courier New" w:hAnsi="Courier New"/>
-                <w:color w:val="111827"/>
-                <w:sz w:val="17"/>
-              </w:rPr>
-              <w:t>Structure: synthesis with required table.</w:t>
-            </w:r>
-          </w:p>
-          <w:p>
-            <w:pPr>
-              <w:spacing w:before="0" w:after="20" w:line="232" w:lineRule="auto"/>
-            </w:pPr>
-            <w:r>
-              <w:rPr>
-                <w:rFonts w:ascii="Courier New" w:hAnsi="Courier New"/>
-                <w:color w:val="111827"/>
-                <w:sz w:val="17"/>
-              </w:rPr>
-              <w:t>Forced slot: convey perfusion uncertainty and what is not proven.</w:t>
-            </w:r>
-          </w:p>
-          <w:p>
-            <w:pPr>
-              <w:spacing w:before="0" w:after="20" w:line="232" w:lineRule="auto"/>
-            </w:pPr>
-            <w:r>
-              <w:rPr>
-                <w:rFonts w:ascii="Courier New" w:hAnsi="Courier New"/>
-                <w:color w:val="111827"/>
-                <w:sz w:val="17"/>
-              </w:rPr>
-              <w:t>Trap: model may overstate vascular adequacy from reassuring bedside language.</w:t>
+              <w:t>8. Vascular surgery referral letter. Requester: hospitalist attending. Forced slot: convey perfusion uncertainty and what is not proven. Trap: overstating vascular adequacy from reassuring bedside language.</w:t>
             </w:r>
           </w:p>
           <w:p>
@@ -3407,72 +3046,7 @@
                 <w:color w:val="111827"/>
                 <w:sz w:val="17"/>
               </w:rPr>
-              <w:t>9. Safety review of missed-offloading event.</w:t>
-            </w:r>
-          </w:p>
-          <w:p>
-            <w:pPr>
-              <w:spacing w:before="0" w:after="20" w:line="232" w:lineRule="auto"/>
-            </w:pPr>
-            <w:r>
-              <w:rPr>
-                <w:rFonts w:ascii="Courier New" w:hAnsi="Courier New"/>
-                <w:color w:val="111827"/>
-                <w:sz w:val="17"/>
-              </w:rPr>
-              <w:t>Requester: hospitalist attending.</w:t>
-            </w:r>
-          </w:p>
-          <w:p>
-            <w:pPr>
-              <w:spacing w:before="0" w:after="20" w:line="232" w:lineRule="auto"/>
-            </w:pPr>
-            <w:r>
-              <w:rPr>
-                <w:rFonts w:ascii="Courier New" w:hAnsi="Courier New"/>
-                <w:color w:val="111827"/>
-                <w:sz w:val="17"/>
-              </w:rPr>
-              <w:t>Workflow: safety event review.</w:t>
-            </w:r>
-          </w:p>
-          <w:p>
-            <w:pPr>
-              <w:spacing w:before="0" w:after="20" w:line="232" w:lineRule="auto"/>
-            </w:pPr>
-            <w:r>
-              <w:rPr>
-                <w:rFonts w:ascii="Courier New" w:hAnsi="Courier New"/>
-                <w:color w:val="111827"/>
-                <w:sz w:val="17"/>
-              </w:rPr>
-              <w:t>Structure: investigation.</w:t>
-            </w:r>
-          </w:p>
-          <w:p>
-            <w:pPr>
-              <w:spacing w:before="0" w:after="20" w:line="232" w:lineRule="auto"/>
-            </w:pPr>
-            <w:r>
-              <w:rPr>
-                <w:rFonts w:ascii="Courier New" w:hAnsi="Courier New"/>
-                <w:color w:val="111827"/>
-                <w:sz w:val="17"/>
-              </w:rPr>
-              <w:t>Forced slot: distinguish blame from system failure and specify prevention.</w:t>
-            </w:r>
-          </w:p>
-          <w:p>
-            <w:pPr>
-              <w:spacing w:before="0" w:after="20" w:line="232" w:lineRule="auto"/>
-            </w:pPr>
-            <w:r>
-              <w:rPr>
-                <w:rFonts w:ascii="Courier New" w:hAnsi="Courier New"/>
-                <w:color w:val="111827"/>
-                <w:sz w:val="17"/>
-              </w:rPr>
-              <w:t>Trap: model may punish an individual or miss DME timing.</w:t>
+              <w:t>9. Safety review of a missed-offloading event. Requester: hospitalist attending. Forced slot: separate system failure from blame and specify prevention. Trap: punishing an individual or missing the equipment-timing cause.</w:t>
             </w:r>
           </w:p>
           <w:p>
@@ -3498,72 +3072,7 @@
                 <w:color w:val="111827"/>
                 <w:sz w:val="17"/>
               </w:rPr>
-              <w:t>10. Finalize discharge instructions from started draft.</w:t>
-            </w:r>
-          </w:p>
-          <w:p>
-            <w:pPr>
-              <w:spacing w:before="0" w:after="20" w:line="232" w:lineRule="auto"/>
-            </w:pPr>
-            <w:r>
-              <w:rPr>
-                <w:rFonts w:ascii="Courier New" w:hAnsi="Courier New"/>
-                <w:color w:val="111827"/>
-                <w:sz w:val="17"/>
-              </w:rPr>
-              <w:t>Requester: hospitalist attending.</w:t>
-            </w:r>
-          </w:p>
-          <w:p>
-            <w:pPr>
-              <w:spacing w:before="0" w:after="20" w:line="232" w:lineRule="auto"/>
-            </w:pPr>
-            <w:r>
-              <w:rPr>
-                <w:rFonts w:ascii="Courier New" w:hAnsi="Courier New"/>
-                <w:color w:val="111827"/>
-                <w:sz w:val="17"/>
-              </w:rPr>
-              <w:t>Workflow: patient-facing discharge instructions.</w:t>
-            </w:r>
-          </w:p>
-          <w:p>
-            <w:pPr>
-              <w:spacing w:before="0" w:after="20" w:line="232" w:lineRule="auto"/>
-            </w:pPr>
-            <w:r>
-              <w:rPr>
-                <w:rFonts w:ascii="Courier New" w:hAnsi="Courier New"/>
-                <w:color w:val="111827"/>
-                <w:sz w:val="17"/>
-              </w:rPr>
-              <w:t>Structure: completion.</w:t>
-            </w:r>
-          </w:p>
-          <w:p>
-            <w:pPr>
-              <w:spacing w:before="0" w:after="20" w:line="232" w:lineRule="auto"/>
-            </w:pPr>
-            <w:r>
-              <w:rPr>
-                <w:rFonts w:ascii="Courier New" w:hAnsi="Courier New"/>
-                <w:color w:val="111827"/>
-                <w:sz w:val="17"/>
-              </w:rPr>
-              <w:t>Forced slot: make instructions safe and bilingual-sensitive without adding unsupported claims.</w:t>
-            </w:r>
-          </w:p>
-          <w:p>
-            <w:pPr>
-              <w:spacing w:before="0" w:after="20" w:line="232" w:lineRule="auto"/>
-            </w:pPr>
-            <w:r>
-              <w:rPr>
-                <w:rFonts w:ascii="Courier New" w:hAnsi="Courier New"/>
-                <w:color w:val="111827"/>
-                <w:sz w:val="17"/>
-              </w:rPr>
-              <w:t>Trap: model may propagate draft language unless placeholders are used or correction is explicit.</w:t>
+              <w:t>10. Finalize discharge instructions from a started draft. Requester: hospitalist attending. Forced slot: make the instructions safe and language-aware without adding unsupported claims. Trap: propagating draft language unless a placeholder is used or correction is explicit.</w:t>
             </w:r>
           </w:p>
         </w:tc>
@@ -3586,7 +3095,7 @@
           <w:color w:val="1F4D78"/>
           <w:sz w:val="24"/>
         </w:rPr>
-        <w:t>10.</w:t>
+        <w:t>13.</w:t>
       </w:r>
     </w:p>
     <w:p>
@@ -3642,7 +3151,177 @@
                 <w:color w:val="111827"/>
                 <w:sz w:val="17"/>
               </w:rPr>
-              <w:t>Review this against actual Brainstorm structure and the Korvin failures. Cover what the checklist missed. The clinician voice is the most important critique.</w:t>
+              <w:t>On the social situation. Make it raise the stakes but keep it out of the scored answer.</w:t>
+            </w:r>
+          </w:p>
+        </w:tc>
+      </w:tr>
+    </w:tbl>
+    <w:p>
+      <w:pPr>
+        <w:spacing w:before="0" w:after="60" w:line="200" w:lineRule="auto"/>
+      </w:pPr>
+    </w:p>
+    <w:p/>
+    <w:p>
+      <w:pPr>
+        <w:spacing w:before="60" w:after="60" w:line="250" w:lineRule="auto"/>
+      </w:pPr>
+      <w:r>
+        <w:rPr>
+          <w:rFonts w:ascii="Arial" w:hAnsi="Arial"/>
+          <w:b/>
+          <w:color w:val="8A5A44"/>
+          <w:sz w:val="22"/>
+        </w:rPr>
+        <w:t>Assistant</w:t>
+      </w:r>
+    </w:p>
+    <w:tbl>
+      <w:tblPr>
+        <w:tblW w:type="dxa" w:w="9360"/>
+        <w:jc w:val="center"/>
+        <w:tblLayout w:type="fixed"/>
+        <w:tblLook w:firstColumn="1" w:firstRow="1" w:lastColumn="0" w:lastRow="0" w:noHBand="0" w:noVBand="1" w:val="04A0"/>
+      </w:tblPr>
+      <w:tblGrid>
+        <w:gridCol w:w="9360"/>
+      </w:tblGrid>
+      <w:tr>
+        <w:tc>
+          <w:tcPr>
+            <w:tcW w:type="dxa" w:w="9360"/>
+            <w:tcMar>
+              <w:top w:w="130" w:type="dxa"/>
+              <w:start w:w="170" w:type="dxa"/>
+              <w:bottom w:w="130" w:type="dxa"/>
+              <w:end w:w="170" w:type="dxa"/>
+            </w:tcMar>
+            <w:vAlign w:val="top"/>
+            <w:shd w:fill="FBF7F0"/>
+            <w:tcBorders>
+              <w:top w:val="single" w:sz="6" w:space="0" w:color="E4D8C8"/>
+              <w:right w:val="single" w:sz="6" w:space="0" w:color="E4D8C8"/>
+              <w:bottom w:val="single" w:sz="6" w:space="0" w:color="E4D8C8"/>
+              <w:left w:val="single" w:sz="14" w:space="0" w:color="8A5A44"/>
+            </w:tcBorders>
+          </w:tcPr>
+          <w:p>
+            <w:pPr>
+              <w:spacing w:before="0" w:after="20" w:line="232" w:lineRule="auto"/>
+            </w:pPr>
+            <w:r>
+              <w:rPr>
+                <w:rFonts w:ascii="Courier New" w:hAnsi="Courier New"/>
+                <w:color w:val="111827"/>
+                <w:sz w:val="17"/>
+              </w:rPr>
+              <w:t>Agreed. The social context is load and explanation, not the hidden trap.</w:t>
+            </w:r>
+          </w:p>
+          <w:p>
+            <w:pPr>
+              <w:spacing w:before="0" w:after="20" w:line="232" w:lineRule="auto"/>
+            </w:pPr>
+            <w:r>
+              <w:rPr>
+                <w:rFonts w:ascii="Courier New" w:hAnsi="Courier New"/>
+                <w:color w:val="111827"/>
+                <w:sz w:val="17"/>
+              </w:rPr>
+              <w:t xml:space="preserve"> </w:t>
+            </w:r>
+          </w:p>
+          <w:p>
+            <w:pPr>
+              <w:spacing w:before="0" w:after="20" w:line="232" w:lineRule="auto"/>
+            </w:pPr>
+            <w:r>
+              <w:rPr>
+                <w:rFonts w:ascii="Courier New" w:hAnsi="Courier New"/>
+                <w:color w:val="111827"/>
+                <w:sz w:val="17"/>
+              </w:rPr>
+              <w:t>Living alone in a second-floor walk-up, a daughter who works nights, language preference, and benefit limits all raise the difficulty of disposition and make the payer appeal real. None of them is the scored item. The scored items stay clinical and administrative, the social facts explain why those decisions matter. I will note that distinction so a reviewer does not mistake the social load for the trap.</w:t>
+            </w:r>
+          </w:p>
+        </w:tc>
+      </w:tr>
+    </w:tbl>
+    <w:p>
+      <w:pPr>
+        <w:spacing w:before="0" w:after="60" w:line="200" w:lineRule="auto"/>
+      </w:pPr>
+    </w:p>
+    <w:p/>
+    <w:p>
+      <w:pPr>
+        <w:spacing w:before="280" w:after="20" w:line="250" w:lineRule="auto"/>
+      </w:pPr>
+      <w:r>
+        <w:rPr>
+          <w:rFonts w:ascii="Arial" w:hAnsi="Arial"/>
+          <w:b/>
+          <w:color w:val="1F4D78"/>
+          <w:sz w:val="24"/>
+        </w:rPr>
+        <w:t>14.</w:t>
+      </w:r>
+    </w:p>
+    <w:p>
+      <w:pPr>
+        <w:spacing w:before="60" w:after="60" w:line="250" w:lineRule="auto"/>
+      </w:pPr>
+      <w:r>
+        <w:rPr>
+          <w:rFonts w:ascii="Arial" w:hAnsi="Arial"/>
+          <w:b/>
+          <w:color w:val="1F4D78"/>
+          <w:sz w:val="22"/>
+        </w:rPr>
+        <w:t>Human</w:t>
+      </w:r>
+    </w:p>
+    <w:tbl>
+      <w:tblPr>
+        <w:tblW w:type="dxa" w:w="9360"/>
+        <w:jc w:val="center"/>
+        <w:tblLayout w:type="fixed"/>
+        <w:tblLook w:firstColumn="1" w:firstRow="1" w:lastColumn="0" w:lastRow="0" w:noHBand="0" w:noVBand="1" w:val="04A0"/>
+      </w:tblPr>
+      <w:tblGrid>
+        <w:gridCol w:w="9360"/>
+      </w:tblGrid>
+      <w:tr>
+        <w:tc>
+          <w:tcPr>
+            <w:tcW w:type="dxa" w:w="9360"/>
+            <w:tcMar>
+              <w:top w:w="130" w:type="dxa"/>
+              <w:start w:w="170" w:type="dxa"/>
+              <w:bottom w:w="130" w:type="dxa"/>
+              <w:end w:w="170" w:type="dxa"/>
+            </w:tcMar>
+            <w:vAlign w:val="top"/>
+            <w:shd w:fill="F6F8FA"/>
+            <w:tcBorders>
+              <w:top w:val="single" w:sz="6" w:space="0" w:color="D0D7DE"/>
+              <w:right w:val="single" w:sz="6" w:space="0" w:color="D0D7DE"/>
+              <w:bottom w:val="single" w:sz="6" w:space="0" w:color="D0D7DE"/>
+              <w:left w:val="single" w:sz="14" w:space="0" w:color="1F4D78"/>
+            </w:tcBorders>
+          </w:tcPr>
+          <w:p>
+            <w:pPr>
+              <w:spacing w:before="0" w:after="20" w:line="232" w:lineRule="auto"/>
+            </w:pPr>
+            <w:r>
+              <w:rPr>
+                <w:rFonts w:ascii="Courier New" w:hAnsi="Courier New"/>
+                <w:color w:val="111827"/>
+                <w:sz w:val="17"/>
+              </w:rPr>
+              <w:t>Review this against the actual Brainstorm structure and the prior-world failures. Cover what the checklist misses. The clinician voice is the most important critique.</w:t>
             </w:r>
           </w:p>
         </w:tc>
@@ -3733,7 +3412,7 @@
                 <w:color w:val="111827"/>
                 <w:sz w:val="17"/>
               </w:rPr>
-              <w:t>The Brainstorm is strong because it has a real patient-care problem, not a puzzle. The patient can look medically better and still be unsafe. That is a true internal medicine tension.</w:t>
+              <w:t>The Brainstorm is strong because it has a real patient-care problem, not a puzzle. The patient can look better and still be unsafe. That is a true internal medicine tension.</w:t>
             </w:r>
           </w:p>
           <w:p>
@@ -3759,7 +3438,7 @@
                 <w:color w:val="111827"/>
                 <w:sz w:val="17"/>
               </w:rPr>
-              <w:t>What the checklist can miss:</w:t>
+              <w:t>What a checklist can miss:</w:t>
             </w:r>
           </w:p>
           <w:p>
@@ -3785,7 +3464,7 @@
                 <w:color w:val="111827"/>
                 <w:sz w:val="17"/>
               </w:rPr>
-              <w:t>1. The pitch must sound like a physician describing a hard admission, not a task designer showing mechanics.</w:t>
+              <w:t>1. The pitch has to sound like a physician describing a hard admission, not a designer showing mechanics.</w:t>
             </w:r>
           </w:p>
           <w:p>
@@ -3798,7 +3477,7 @@
                 <w:color w:val="111827"/>
                 <w:sz w:val="17"/>
               </w:rPr>
-              <w:t>2. The payer denial cannot be cosmetic. It has to force a real medical judgment about disposition risk.</w:t>
+              <w:t>2. The payer denial cannot be cosmetic. It has to force a real judgment about disposition risk.</w:t>
             </w:r>
           </w:p>
           <w:p>
@@ -3811,7 +3490,7 @@
                 <w:color w:val="111827"/>
                 <w:sz w:val="17"/>
               </w:rPr>
-              <w:t>3. Osteomyelitis restraint has to be clinically owned. If the chart is equivocal, the correct answer is not to diagnose harder.</w:t>
+              <w:t>3. Osteomyelitis restraint has to be clinically owned. If the chart is equivocal, the correct move is not to diagnose harder.</w:t>
             </w:r>
           </w:p>
           <w:p>
@@ -3824,7 +3503,7 @@
                 <w:color w:val="111827"/>
                 <w:sz w:val="17"/>
               </w:rPr>
-              <w:t>4. SDOH should raise load and explain why decisions matter, but it should not be the hidden scored trap.</w:t>
+              <w:t>4. Social context should raise load and explain why decisions matter, not be the hidden scored trap.</w:t>
             </w:r>
           </w:p>
           <w:p>
@@ -3837,7 +3516,7 @@
                 <w:color w:val="111827"/>
                 <w:sz w:val="17"/>
               </w:rPr>
-              <w:t>5. Every task needs a named requester and a credible reason that requester needs the physician now.</w:t>
+              <w:t>5. Every task needs a named requester and a credible reason that person needs the physician now.</w:t>
             </w:r>
           </w:p>
           <w:p>
@@ -3850,7 +3529,7 @@
                 <w:color w:val="111827"/>
                 <w:sz w:val="17"/>
               </w:rPr>
-              <w:t>6. Same-author started drafts need placeholders or explicit correction instructions. External wrong-by-genre documents are fair rebuttal surfaces.</w:t>
+              <w:t>6. Same-author started drafts need placeholders or explicit correction. External wrong-by-genre documents are fair rebuttal surfaces.</w:t>
             </w:r>
           </w:p>
           <w:p>
@@ -3902,7 +3581,7 @@
                 <w:color w:val="111827"/>
                 <w:sz w:val="17"/>
               </w:rPr>
-              <w:t>1. Expand the comorbidity profile to at least ten conditions, written as a real problem list, so the case carries the load a single organ-system story would not.</w:t>
+              <w:t>1. Expand the comorbidity profile to a real problem list of at least ten conditions, so the case carries the load a single-organ story would not.</w:t>
             </w:r>
           </w:p>
           <w:p>
@@ -3915,7 +3594,7 @@
                 <w:color w:val="111827"/>
                 <w:sz w:val="17"/>
               </w:rPr>
-              <w:t>2. Remove internal labels and any task-design or platform vocabulary from the reviewer-facing version. The reviewer should read it as a clinical proposal, not as mechanics.</w:t>
+              <w:t>2. Remove internal labels and any task-design or platform vocabulary from the reviewer-facing version.</w:t>
             </w:r>
           </w:p>
           <w:p>
@@ -3928,7 +3607,7 @@
                 <w:color w:val="111827"/>
                 <w:sz w:val="17"/>
               </w:rPr>
-              <w:t>3. Add per-task P0 or P1 priority labels, not just an aggregate note.</w:t>
+              <w:t>3. Add per-task priority labels, not just an aggregate note.</w:t>
             </w:r>
           </w:p>
           <w:p>
@@ -3941,7 +3620,7 @@
                 <w:color w:val="111827"/>
                 <w:sz w:val="17"/>
               </w:rPr>
-              <w:t>4. Keep the Brainstorm at concept depth. Do not invent medication doses or final lab values here; those belong to the substrate stage where they can be ratified.</w:t>
+              <w:t>4. Keep the Brainstorm at concept depth. Do not invent doses or final lab values here; those belong to the substrate stage where they can be ratified.</w:t>
             </w:r>
           </w:p>
           <w:p>
@@ -3954,7 +3633,7 @@
                 <w:color w:val="111827"/>
                 <w:sz w:val="17"/>
               </w:rPr>
-              <w:t>5. Carry the Korvin lesson forward. Fairness is judged on what the built files actually say, not on what the plan intends, so every trap must stay refutable from the chart and no reviewer-facing file should leak internal or source register.</w:t>
+              <w:t>5. Carry the prior-world lesson forward. Fairness is judged on what the built files actually say, so every trap must stay refutable from the chart and no reviewer-facing file should leak internal or source register.</w:t>
             </w:r>
           </w:p>
         </w:tc>
@@ -3977,7 +3656,7 @@
           <w:color w:val="1F4D78"/>
           <w:sz w:val="24"/>
         </w:rPr>
-        <w:t>11.</w:t>
+        <w:t>15.</w:t>
       </w:r>
     </w:p>
     <w:p>
@@ -4098,7 +3777,7 @@
                 <w:color w:val="111827"/>
                 <w:sz w:val="17"/>
               </w:rPr>
-              <w:t>Applied concept-level comorbidity expansion:</w:t>
+              <w:t>Concept-level comorbidity expansion:</w:t>
             </w:r>
           </w:p>
           <w:p>
@@ -4124,163 +3803,7 @@
                 <w:color w:val="111827"/>
                 <w:sz w:val="17"/>
               </w:rPr>
-              <w:t>Insulin-dependent type 2 diabetes.</w:t>
-            </w:r>
-          </w:p>
-          <w:p>
-            <w:pPr>
-              <w:spacing w:before="0" w:after="20" w:line="232" w:lineRule="auto"/>
-            </w:pPr>
-            <w:r>
-              <w:rPr>
-                <w:rFonts w:ascii="Courier New" w:hAnsi="Courier New"/>
-                <w:color w:val="111827"/>
-                <w:sz w:val="17"/>
-              </w:rPr>
-              <w:t>Diabetic peripheral neuropathy.</w:t>
-            </w:r>
-          </w:p>
-          <w:p>
-            <w:pPr>
-              <w:spacing w:before="0" w:after="20" w:line="232" w:lineRule="auto"/>
-            </w:pPr>
-            <w:r>
-              <w:rPr>
-                <w:rFonts w:ascii="Courier New" w:hAnsi="Courier New"/>
-                <w:color w:val="111827"/>
-                <w:sz w:val="17"/>
-              </w:rPr>
-              <w:t>Mild diabetic retinopathy.</w:t>
-            </w:r>
-          </w:p>
-          <w:p>
-            <w:pPr>
-              <w:spacing w:before="0" w:after="20" w:line="232" w:lineRule="auto"/>
-            </w:pPr>
-            <w:r>
-              <w:rPr>
-                <w:rFonts w:ascii="Courier New" w:hAnsi="Courier New"/>
-                <w:color w:val="111827"/>
-                <w:sz w:val="17"/>
-              </w:rPr>
-              <w:t>CKD 3b.</w:t>
-            </w:r>
-          </w:p>
-          <w:p>
-            <w:pPr>
-              <w:spacing w:before="0" w:after="20" w:line="232" w:lineRule="auto"/>
-            </w:pPr>
-            <w:r>
-              <w:rPr>
-                <w:rFonts w:ascii="Courier New" w:hAnsi="Courier New"/>
-                <w:color w:val="111827"/>
-                <w:sz w:val="17"/>
-              </w:rPr>
-              <w:t>Anemia of CKD.</w:t>
-            </w:r>
-          </w:p>
-          <w:p>
-            <w:pPr>
-              <w:spacing w:before="0" w:after="20" w:line="232" w:lineRule="auto"/>
-            </w:pPr>
-            <w:r>
-              <w:rPr>
-                <w:rFonts w:ascii="Courier New" w:hAnsi="Courier New"/>
-                <w:color w:val="111827"/>
-                <w:sz w:val="17"/>
-              </w:rPr>
-              <w:t>Peripheral arterial disease.</w:t>
-            </w:r>
-          </w:p>
-          <w:p>
-            <w:pPr>
-              <w:spacing w:before="0" w:after="20" w:line="232" w:lineRule="auto"/>
-            </w:pPr>
-            <w:r>
-              <w:rPr>
-                <w:rFonts w:ascii="Courier New" w:hAnsi="Courier New"/>
-                <w:color w:val="111827"/>
-                <w:sz w:val="17"/>
-              </w:rPr>
-              <w:t>HFpEF.</w:t>
-            </w:r>
-          </w:p>
-          <w:p>
-            <w:pPr>
-              <w:spacing w:before="0" w:after="20" w:line="232" w:lineRule="auto"/>
-            </w:pPr>
-            <w:r>
-              <w:rPr>
-                <w:rFonts w:ascii="Courier New" w:hAnsi="Courier New"/>
-                <w:color w:val="111827"/>
-                <w:sz w:val="17"/>
-              </w:rPr>
-              <w:t>Hypertension.</w:t>
-            </w:r>
-          </w:p>
-          <w:p>
-            <w:pPr>
-              <w:spacing w:before="0" w:after="20" w:line="232" w:lineRule="auto"/>
-            </w:pPr>
-            <w:r>
-              <w:rPr>
-                <w:rFonts w:ascii="Courier New" w:hAnsi="Courier New"/>
-                <w:color w:val="111827"/>
-                <w:sz w:val="17"/>
-              </w:rPr>
-              <w:t>Dyslipidemia.</w:t>
-            </w:r>
-          </w:p>
-          <w:p>
-            <w:pPr>
-              <w:spacing w:before="0" w:after="20" w:line="232" w:lineRule="auto"/>
-            </w:pPr>
-            <w:r>
-              <w:rPr>
-                <w:rFonts w:ascii="Courier New" w:hAnsi="Courier New"/>
-                <w:color w:val="111827"/>
-                <w:sz w:val="17"/>
-              </w:rPr>
-              <w:t>Obesity.</w:t>
-            </w:r>
-          </w:p>
-          <w:p>
-            <w:pPr>
-              <w:spacing w:before="0" w:after="20" w:line="232" w:lineRule="auto"/>
-            </w:pPr>
-            <w:r>
-              <w:rPr>
-                <w:rFonts w:ascii="Courier New" w:hAnsi="Courier New"/>
-                <w:color w:val="111827"/>
-                <w:sz w:val="17"/>
-              </w:rPr>
-              <w:t>Obstructive sleep apnea.</w:t>
-            </w:r>
-          </w:p>
-          <w:p>
-            <w:pPr>
-              <w:spacing w:before="0" w:after="20" w:line="232" w:lineRule="auto"/>
-            </w:pPr>
-            <w:r>
-              <w:rPr>
-                <w:rFonts w:ascii="Courier New" w:hAnsi="Courier New"/>
-                <w:color w:val="111827"/>
-                <w:sz w:val="17"/>
-              </w:rPr>
-              <w:t>Osteoarthritis.</w:t>
-            </w:r>
-          </w:p>
-          <w:p>
-            <w:pPr>
-              <w:spacing w:before="0" w:after="20" w:line="232" w:lineRule="auto"/>
-            </w:pPr>
-            <w:r>
-              <w:rPr>
-                <w:rFonts w:ascii="Courier New" w:hAnsi="Courier New"/>
-                <w:color w:val="111827"/>
-                <w:sz w:val="17"/>
-              </w:rPr>
-              <w:t>Limited mobility.</w:t>
+              <w:t>Insulin-dependent type 2 diabetes. Diabetic peripheral neuropathy. Mild diabetic retinopathy. Kidney disease stage 3b. Anemia of kidney disease. Peripheral arterial disease. Heart failure with preserved ejection fraction. Hypertension. Dyslipidemia. Obesity. Obstructive sleep apnea. Osteoarthritis. Limited mobility.</w:t>
             </w:r>
           </w:p>
           <w:p>
@@ -4332,85 +3855,7 @@
                 <w:color w:val="111827"/>
                 <w:sz w:val="17"/>
               </w:rPr>
-              <w:t>World Type declaration placed in the first paragraph.</w:t>
-            </w:r>
-          </w:p>
-          <w:p>
-            <w:pPr>
-              <w:spacing w:before="0" w:after="20" w:line="232" w:lineRule="auto"/>
-            </w:pPr>
-            <w:r>
-              <w:rPr>
-                <w:rFonts w:ascii="Courier New" w:hAnsi="Courier New"/>
-                <w:color w:val="111827"/>
-                <w:sz w:val="17"/>
-              </w:rPr>
-              <w:t>Internal labels removed.</w:t>
-            </w:r>
-          </w:p>
-          <w:p>
-            <w:pPr>
-              <w:spacing w:before="0" w:after="20" w:line="232" w:lineRule="auto"/>
-            </w:pPr>
-            <w:r>
-              <w:rPr>
-                <w:rFonts w:ascii="Courier New" w:hAnsi="Courier New"/>
-                <w:color w:val="111827"/>
-                <w:sz w:val="17"/>
-              </w:rPr>
-              <w:t>Task table kept reviewer-facing.</w:t>
-            </w:r>
-          </w:p>
-          <w:p>
-            <w:pPr>
-              <w:spacing w:before="0" w:after="20" w:line="232" w:lineRule="auto"/>
-            </w:pPr>
-            <w:r>
-              <w:rPr>
-                <w:rFonts w:ascii="Courier New" w:hAnsi="Courier New"/>
-                <w:color w:val="111827"/>
-                <w:sz w:val="17"/>
-              </w:rPr>
-              <w:t>Task structures flattened to plain categories.</w:t>
-            </w:r>
-          </w:p>
-          <w:p>
-            <w:pPr>
-              <w:spacing w:before="0" w:after="20" w:line="232" w:lineRule="auto"/>
-            </w:pPr>
-            <w:r>
-              <w:rPr>
-                <w:rFonts w:ascii="Courier New" w:hAnsi="Courier New"/>
-                <w:color w:val="111827"/>
-                <w:sz w:val="17"/>
-              </w:rPr>
-              <w:t>Requester roles retained.</w:t>
-            </w:r>
-          </w:p>
-          <w:p>
-            <w:pPr>
-              <w:spacing w:before="0" w:after="20" w:line="232" w:lineRule="auto"/>
-            </w:pPr>
-            <w:r>
-              <w:rPr>
-                <w:rFonts w:ascii="Courier New" w:hAnsi="Courier New"/>
-                <w:color w:val="111827"/>
-                <w:sz w:val="17"/>
-              </w:rPr>
-              <w:t>Forced slot retained per task.</w:t>
-            </w:r>
-          </w:p>
-          <w:p>
-            <w:pPr>
-              <w:spacing w:before="0" w:after="20" w:line="232" w:lineRule="auto"/>
-            </w:pPr>
-            <w:r>
-              <w:rPr>
-                <w:rFonts w:ascii="Courier New" w:hAnsi="Courier New"/>
-                <w:color w:val="111827"/>
-                <w:sz w:val="17"/>
-              </w:rPr>
-              <w:t>Distinct task-level trap retained per task.</w:t>
+              <w:t>World type declaration placed in the first line. Internal labels removed. Task table kept reviewer-facing. Task structures stated as plain categories. Requester roles retained. Forced slot retained per task. A distinct task-level trap retained per task.</w:t>
             </w:r>
           </w:p>
         </w:tc>
@@ -4433,7 +3878,7 @@
           <w:color w:val="1F4D78"/>
           <w:sz w:val="24"/>
         </w:rPr>
-        <w:t>12.</w:t>
+        <w:t>16.</w:t>
       </w:r>
     </w:p>
     <w:p>
@@ -4554,7 +3999,7 @@
                 <w:color w:val="111827"/>
                 <w:sz w:val="17"/>
               </w:rPr>
-              <w:t>That is a valid finding. Patch, do not argue.</w:t>
+              <w:t>Valid finding. Patch, do not argue.</w:t>
             </w:r>
           </w:p>
           <w:p>
@@ -4580,20 +4025,7 @@
                 <w:color w:val="111827"/>
                 <w:sz w:val="17"/>
               </w:rPr>
-              <w:t>Fix:</w:t>
-            </w:r>
-          </w:p>
-          <w:p>
-            <w:pPr>
-              <w:spacing w:before="0" w:after="20" w:line="232" w:lineRule="auto"/>
-            </w:pPr>
-            <w:r>
-              <w:rPr>
-                <w:rFonts w:ascii="Courier New" w:hAnsi="Courier New"/>
-                <w:color w:val="111827"/>
-                <w:sz w:val="17"/>
-              </w:rPr>
-              <w:t>Add a Priority column to the ten-task table.</w:t>
+              <w:t>Fix: add a priority column to the ten-task table.</w:t>
             </w:r>
           </w:p>
           <w:p>
@@ -4619,46 +4051,7 @@
                 <w:color w:val="111827"/>
                 <w:sz w:val="17"/>
               </w:rPr>
-              <w:t>Assignments:</w:t>
-            </w:r>
-          </w:p>
-          <w:p>
-            <w:pPr>
-              <w:spacing w:before="0" w:after="20" w:line="232" w:lineRule="auto"/>
-            </w:pPr>
-            <w:r>
-              <w:rPr>
-                <w:rFonts w:ascii="Courier New" w:hAnsi="Courier New"/>
-                <w:color w:val="111827"/>
-                <w:sz w:val="17"/>
-              </w:rPr>
-              <w:t>Tasks 1 through 5: P0.</w:t>
-            </w:r>
-          </w:p>
-          <w:p>
-            <w:pPr>
-              <w:spacing w:before="0" w:after="20" w:line="232" w:lineRule="auto"/>
-            </w:pPr>
-            <w:r>
-              <w:rPr>
-                <w:rFonts w:ascii="Courier New" w:hAnsi="Courier New"/>
-                <w:color w:val="111827"/>
-                <w:sz w:val="17"/>
-              </w:rPr>
-              <w:t>Task 6: P1.</w:t>
-            </w:r>
-          </w:p>
-          <w:p>
-            <w:pPr>
-              <w:spacing w:before="0" w:after="20" w:line="232" w:lineRule="auto"/>
-            </w:pPr>
-            <w:r>
-              <w:rPr>
-                <w:rFonts w:ascii="Courier New" w:hAnsi="Courier New"/>
-                <w:color w:val="111827"/>
-                <w:sz w:val="17"/>
-              </w:rPr>
-              <w:t>Tasks 7 through 10: P0.</w:t>
+              <w:t>Assignments: tasks one through five are P0, task six is P1, tasks seven through ten are P0.</w:t>
             </w:r>
           </w:p>
           <w:p>
@@ -4684,20 +4077,7 @@
                 <w:color w:val="111827"/>
                 <w:sz w:val="17"/>
               </w:rPr>
-              <w:t>Update the supporting line:</w:t>
-            </w:r>
-          </w:p>
-          <w:p>
-            <w:pPr>
-              <w:spacing w:before="0" w:after="20" w:line="232" w:lineRule="auto"/>
-            </w:pPr>
-            <w:r>
-              <w:rPr>
-                <w:rFonts w:ascii="Courier New" w:hAnsi="Courier New"/>
-                <w:color w:val="111827"/>
-                <w:sz w:val="17"/>
-              </w:rPr>
-              <w:t>Priority labels are explicit per task. Tasks 1 through 5 and 7 through 10 are P0. Task 6 is P1.</w:t>
+              <w:t>Supporting line: priority labels are explicit per task. Tasks one through five and seven through ten are P0, task six is P1.</w:t>
             </w:r>
           </w:p>
           <w:p>
@@ -4723,7 +4103,7 @@
                 <w:color w:val="111827"/>
                 <w:sz w:val="17"/>
               </w:rPr>
-              <w:t>This preserves the slate and closes the formal gate.</w:t>
+              <w:t>This keeps the slate and closes the formal gate.</w:t>
             </w:r>
           </w:p>
         </w:tc>
@@ -4746,7 +4126,7 @@
           <w:color w:val="1F4D78"/>
           <w:sz w:val="24"/>
         </w:rPr>
-        <w:t>13.</w:t>
+        <w:t>17.</w:t>
       </w:r>
     </w:p>
     <w:p>
@@ -4802,7 +4182,7 @@
                 <w:color w:val="111827"/>
                 <w:sz w:val="17"/>
               </w:rPr>
-              <w:t>AutoQC passed. What next for us? Are we following the steps from the Korvin world to World Spec, templates, and submission?</w:t>
+              <w:t>AutoQC passed. What next for us? Are we following the prior-world steps to World Spec, templates, and submission?</w:t>
             </w:r>
           </w:p>
         </w:tc>
@@ -4867,7 +4247,7 @@
                 <w:color w:val="111827"/>
                 <w:sz w:val="17"/>
               </w:rPr>
-              <w:t>Next is human Brainstorm review, then World Spec. Do not draft the World Spec until the Brainstorm receives human GO and you authorize the phase shift.</w:t>
+              <w:t>Next is human Brainstorm review, then the World Spec. Do not draft the World Spec until the Brainstorm receives human approval and you authorize the phase shift.</w:t>
             </w:r>
           </w:p>
           <w:p>
@@ -4932,7 +4312,7 @@
                 <w:color w:val="111827"/>
                 <w:sz w:val="17"/>
               </w:rPr>
-              <w:t>2. World-level files, minimum 30 for new worlds.</w:t>
+              <w:t>2. World-level files, at least thirty for a new world.</w:t>
             </w:r>
           </w:p>
           <w:p>
@@ -4945,7 +4325,7 @@
                 <w:color w:val="111827"/>
                 <w:sz w:val="17"/>
               </w:rPr>
-              <w:t>3. Reference file package.</w:t>
+              <w:t>3. The reference file package.</w:t>
             </w:r>
           </w:p>
           <w:p>
@@ -4958,7 +4338,7 @@
                 <w:color w:val="111827"/>
                 <w:sz w:val="17"/>
               </w:rPr>
-              <w:t>4. Brainstorm Claude transcript.</w:t>
+              <w:t>4. The Brainstorm transcript.</w:t>
             </w:r>
           </w:p>
           <w:p>
@@ -4971,7 +4351,7 @@
                 <w:color w:val="111827"/>
                 <w:sz w:val="17"/>
               </w:rPr>
-              <w:t>5. World Spec Claude transcript.</w:t>
+              <w:t>5. The World Spec transcript.</w:t>
             </w:r>
           </w:p>
           <w:p>
@@ -4997,7 +4377,7 @@
                 <w:color w:val="111827"/>
                 <w:sz w:val="17"/>
               </w:rPr>
-              <w:t>The Brainstorm transcript should show the real workflow shape: physician-owned decisions, Claude-supported option generation, critique, patching after AutoQC, and final readiness.</w:t>
+              <w:t>The Brainstorm transcript should show the real shape of the work: physician-owned decisions, supported option generation, critique, the patch after the automated check, and the readiness call.</w:t>
             </w:r>
           </w:p>
         </w:tc>
@@ -5020,7 +4400,7 @@
           <w:color w:val="1F4D78"/>
           <w:sz w:val="24"/>
         </w:rPr>
-        <w:t>14.</w:t>
+        <w:t>18.</w:t>
       </w:r>
     </w:p>
     <w:p>
@@ -5203,7 +4583,7 @@
           <w:color w:val="1F4D78"/>
           <w:sz w:val="24"/>
         </w:rPr>
-        <w:t>15.</w:t>
+        <w:t>19.</w:t>
       </w:r>
     </w:p>
     <w:p>
@@ -5350,7 +4730,7 @@
                 <w:color w:val="111827"/>
                 <w:sz w:val="17"/>
               </w:rPr>
-              <w:t>Brainstorm is ready for human review.</w:t>
+              <w:t>The Brainstorm is ready for human review. It contains four required concept elements, ten tasks, per-task requester roles, per-task workflow and priority labels, per-task forced slots, distinct task-level traps, an explicit snapshot date and time, independent post-snapshot task branches, no dependence on knowledge after July 2025, and no same-author planted-falsehood mechanism.</w:t>
             </w:r>
           </w:p>
           <w:p>
@@ -5376,176 +4756,7 @@
                 <w:color w:val="111827"/>
                 <w:sz w:val="17"/>
               </w:rPr>
-              <w:t>It contains:</w:t>
-            </w:r>
-          </w:p>
-          <w:p>
-            <w:pPr>
-              <w:spacing w:before="0" w:after="20" w:line="232" w:lineRule="auto"/>
-            </w:pPr>
-            <w:r>
-              <w:rPr>
-                <w:rFonts w:ascii="Courier New" w:hAnsi="Courier New"/>
-                <w:color w:val="111827"/>
-                <w:sz w:val="17"/>
-              </w:rPr>
-              <w:t>Four required concept elements.</w:t>
-            </w:r>
-          </w:p>
-          <w:p>
-            <w:pPr>
-              <w:spacing w:before="0" w:after="20" w:line="232" w:lineRule="auto"/>
-            </w:pPr>
-            <w:r>
-              <w:rPr>
-                <w:rFonts w:ascii="Courier New" w:hAnsi="Courier New"/>
-                <w:color w:val="111827"/>
-                <w:sz w:val="17"/>
-              </w:rPr>
-              <w:t>Ten tasks.</w:t>
-            </w:r>
-          </w:p>
-          <w:p>
-            <w:pPr>
-              <w:spacing w:before="0" w:after="20" w:line="232" w:lineRule="auto"/>
-            </w:pPr>
-            <w:r>
-              <w:rPr>
-                <w:rFonts w:ascii="Courier New" w:hAnsi="Courier New"/>
-                <w:color w:val="111827"/>
-                <w:sz w:val="17"/>
-              </w:rPr>
-              <w:t>Per-task requester roles.</w:t>
-            </w:r>
-          </w:p>
-          <w:p>
-            <w:pPr>
-              <w:spacing w:before="0" w:after="20" w:line="232" w:lineRule="auto"/>
-            </w:pPr>
-            <w:r>
-              <w:rPr>
-                <w:rFonts w:ascii="Courier New" w:hAnsi="Courier New"/>
-                <w:color w:val="111827"/>
-                <w:sz w:val="17"/>
-              </w:rPr>
-              <w:t>Per-task workflow and priority labels.</w:t>
-            </w:r>
-          </w:p>
-          <w:p>
-            <w:pPr>
-              <w:spacing w:before="0" w:after="20" w:line="232" w:lineRule="auto"/>
-            </w:pPr>
-            <w:r>
-              <w:rPr>
-                <w:rFonts w:ascii="Courier New" w:hAnsi="Courier New"/>
-                <w:color w:val="111827"/>
-                <w:sz w:val="17"/>
-              </w:rPr>
-              <w:t>Per-task forced slots.</w:t>
-            </w:r>
-          </w:p>
-          <w:p>
-            <w:pPr>
-              <w:spacing w:before="0" w:after="20" w:line="232" w:lineRule="auto"/>
-            </w:pPr>
-            <w:r>
-              <w:rPr>
-                <w:rFonts w:ascii="Courier New" w:hAnsi="Courier New"/>
-                <w:color w:val="111827"/>
-                <w:sz w:val="17"/>
-              </w:rPr>
-              <w:t>Distinct task-level traps.</w:t>
-            </w:r>
-          </w:p>
-          <w:p>
-            <w:pPr>
-              <w:spacing w:before="0" w:after="20" w:line="232" w:lineRule="auto"/>
-            </w:pPr>
-            <w:r>
-              <w:rPr>
-                <w:rFonts w:ascii="Courier New" w:hAnsi="Courier New"/>
-                <w:color w:val="111827"/>
-                <w:sz w:val="17"/>
-              </w:rPr>
-              <w:t>Explicit snapshot date and time.</w:t>
-            </w:r>
-          </w:p>
-          <w:p>
-            <w:pPr>
-              <w:spacing w:before="0" w:after="20" w:line="232" w:lineRule="auto"/>
-            </w:pPr>
-            <w:r>
-              <w:rPr>
-                <w:rFonts w:ascii="Courier New" w:hAnsi="Courier New"/>
-                <w:color w:val="111827"/>
-                <w:sz w:val="17"/>
-              </w:rPr>
-              <w:t>Independent post-snapshot task branches.</w:t>
-            </w:r>
-          </w:p>
-          <w:p>
-            <w:pPr>
-              <w:spacing w:before="0" w:after="20" w:line="232" w:lineRule="auto"/>
-            </w:pPr>
-            <w:r>
-              <w:rPr>
-                <w:rFonts w:ascii="Courier New" w:hAnsi="Courier New"/>
-                <w:color w:val="111827"/>
-                <w:sz w:val="17"/>
-              </w:rPr>
-              <w:t>No post-July 2025 knowledge dependency.</w:t>
-            </w:r>
-          </w:p>
-          <w:p>
-            <w:pPr>
-              <w:spacing w:before="0" w:after="20" w:line="232" w:lineRule="auto"/>
-            </w:pPr>
-            <w:r>
-              <w:rPr>
-                <w:rFonts w:ascii="Courier New" w:hAnsi="Courier New"/>
-                <w:color w:val="111827"/>
-                <w:sz w:val="17"/>
-              </w:rPr>
-              <w:t>No same-author planted falsehood mechanism.</w:t>
-            </w:r>
-          </w:p>
-          <w:p>
-            <w:pPr>
-              <w:spacing w:before="0" w:after="20" w:line="232" w:lineRule="auto"/>
-            </w:pPr>
-            <w:r>
-              <w:rPr>
-                <w:rFonts w:ascii="Courier New" w:hAnsi="Courier New"/>
-                <w:color w:val="111827"/>
-                <w:sz w:val="17"/>
-              </w:rPr>
-              <w:t xml:space="preserve"> </w:t>
-            </w:r>
-          </w:p>
-          <w:p>
-            <w:pPr>
-              <w:spacing w:before="0" w:after="20" w:line="232" w:lineRule="auto"/>
-            </w:pPr>
-            <w:r>
-              <w:rPr>
-                <w:rFonts w:ascii="Courier New" w:hAnsi="Courier New"/>
-                <w:color w:val="111827"/>
-                <w:sz w:val="17"/>
-              </w:rPr>
-              <w:t>Boundary:</w:t>
-            </w:r>
-          </w:p>
-          <w:p>
-            <w:pPr>
-              <w:spacing w:before="0" w:after="20" w:line="232" w:lineRule="auto"/>
-            </w:pPr>
-            <w:r>
-              <w:rPr>
-                <w:rFonts w:ascii="Courier New" w:hAnsi="Courier New"/>
-                <w:color w:val="111827"/>
-                <w:sz w:val="17"/>
-              </w:rPr>
-              <w:t>World Spec drafting remains closed until human Brainstorm review returns GO and Alexander authorizes the next phase.</w:t>
+              <w:t>Boundary: World Spec drafting stays closed until human Brainstorm review returns approval and you authorize the next phase.</w:t>
             </w:r>
           </w:p>
         </w:tc>

</xml_diff>